<commit_message>
docs(bt2): cập nhật báo cáo Bài tập 2 – bổ sung khai báo AI giai đoạn BT1 và cam kết
</commit_message>
<xml_diff>
--- a/BT2_2374802012635_ThaiAnQuoc/BT2_2374802012635_ThaiAnQuoc.docx
+++ b/BT2_2374802012635_ThaiAnQuoc/BT2_2374802012635_ThaiAnQuoc.docx
@@ -544,7 +544,7 @@
               <w:tab w:val="right" w:leader="dot" w:pos="9628"/>
             </w:tabs>
             <w:rPr>
-              <w:rFonts w:asciiTheme="minorHAnsi" w:eastAsiaTheme="minorEastAsia" w:hAnsiTheme="minorHAnsi" w:cstheme="minorBidi"/>
+              <w:rFonts w:eastAsiaTheme="minorEastAsia"/>
               <w:noProof/>
               <w:kern w:val="2"/>
               <w:sz w:val="24"/>
@@ -631,7 +631,7 @@
               <w:tab w:val="right" w:leader="dot" w:pos="9628"/>
             </w:tabs>
             <w:rPr>
-              <w:rFonts w:asciiTheme="minorHAnsi" w:eastAsiaTheme="minorEastAsia" w:hAnsiTheme="minorHAnsi" w:cstheme="minorBidi"/>
+              <w:rFonts w:eastAsiaTheme="minorEastAsia"/>
               <w:noProof/>
               <w:kern w:val="2"/>
               <w:sz w:val="24"/>
@@ -697,7 +697,7 @@
               <w:tab w:val="right" w:leader="dot" w:pos="9628"/>
             </w:tabs>
             <w:rPr>
-              <w:rFonts w:asciiTheme="minorHAnsi" w:eastAsiaTheme="minorEastAsia" w:hAnsiTheme="minorHAnsi" w:cstheme="minorBidi"/>
+              <w:rFonts w:eastAsiaTheme="minorEastAsia"/>
               <w:noProof/>
               <w:kern w:val="2"/>
               <w:sz w:val="24"/>
@@ -763,7 +763,7 @@
               <w:tab w:val="right" w:leader="dot" w:pos="9628"/>
             </w:tabs>
             <w:rPr>
-              <w:rFonts w:asciiTheme="minorHAnsi" w:eastAsiaTheme="minorEastAsia" w:hAnsiTheme="minorHAnsi" w:cstheme="minorBidi"/>
+              <w:rFonts w:eastAsiaTheme="minorEastAsia"/>
               <w:noProof/>
               <w:kern w:val="2"/>
               <w:sz w:val="24"/>
@@ -829,7 +829,7 @@
               <w:tab w:val="right" w:leader="dot" w:pos="9628"/>
             </w:tabs>
             <w:rPr>
-              <w:rFonts w:asciiTheme="minorHAnsi" w:eastAsiaTheme="minorEastAsia" w:hAnsiTheme="minorHAnsi" w:cstheme="minorBidi"/>
+              <w:rFonts w:eastAsiaTheme="minorEastAsia"/>
               <w:noProof/>
               <w:kern w:val="2"/>
               <w:sz w:val="24"/>
@@ -895,7 +895,7 @@
               <w:tab w:val="right" w:leader="dot" w:pos="9628"/>
             </w:tabs>
             <w:rPr>
-              <w:rFonts w:asciiTheme="minorHAnsi" w:eastAsiaTheme="minorEastAsia" w:hAnsiTheme="minorHAnsi" w:cstheme="minorBidi"/>
+              <w:rFonts w:eastAsiaTheme="minorEastAsia"/>
               <w:noProof/>
               <w:kern w:val="2"/>
               <w:sz w:val="24"/>
@@ -961,7 +961,7 @@
               <w:tab w:val="right" w:leader="dot" w:pos="9628"/>
             </w:tabs>
             <w:rPr>
-              <w:rFonts w:asciiTheme="minorHAnsi" w:eastAsiaTheme="minorEastAsia" w:hAnsiTheme="minorHAnsi" w:cstheme="minorBidi"/>
+              <w:rFonts w:eastAsiaTheme="minorEastAsia"/>
               <w:noProof/>
               <w:kern w:val="2"/>
               <w:sz w:val="24"/>
@@ -1027,7 +1027,7 @@
               <w:tab w:val="right" w:leader="dot" w:pos="9628"/>
             </w:tabs>
             <w:rPr>
-              <w:rFonts w:asciiTheme="minorHAnsi" w:eastAsiaTheme="minorEastAsia" w:hAnsiTheme="minorHAnsi" w:cstheme="minorBidi"/>
+              <w:rFonts w:eastAsiaTheme="minorEastAsia"/>
               <w:noProof/>
               <w:kern w:val="2"/>
               <w:sz w:val="24"/>
@@ -1093,7 +1093,7 @@
               <w:tab w:val="right" w:leader="dot" w:pos="9628"/>
             </w:tabs>
             <w:rPr>
-              <w:rFonts w:asciiTheme="minorHAnsi" w:eastAsiaTheme="minorEastAsia" w:hAnsiTheme="minorHAnsi" w:cstheme="minorBidi"/>
+              <w:rFonts w:eastAsiaTheme="minorEastAsia"/>
               <w:noProof/>
               <w:kern w:val="2"/>
               <w:sz w:val="24"/>
@@ -1159,7 +1159,7 @@
               <w:tab w:val="right" w:leader="dot" w:pos="9628"/>
             </w:tabs>
             <w:rPr>
-              <w:rFonts w:asciiTheme="minorHAnsi" w:eastAsiaTheme="minorEastAsia" w:hAnsiTheme="minorHAnsi" w:cstheme="minorBidi"/>
+              <w:rFonts w:eastAsiaTheme="minorEastAsia"/>
               <w:noProof/>
               <w:kern w:val="2"/>
               <w:sz w:val="24"/>
@@ -1225,7 +1225,7 @@
               <w:tab w:val="right" w:leader="dot" w:pos="9628"/>
             </w:tabs>
             <w:rPr>
-              <w:rFonts w:asciiTheme="minorHAnsi" w:eastAsiaTheme="minorEastAsia" w:hAnsiTheme="minorHAnsi" w:cstheme="minorBidi"/>
+              <w:rFonts w:eastAsiaTheme="minorEastAsia"/>
               <w:noProof/>
               <w:kern w:val="2"/>
               <w:sz w:val="24"/>
@@ -1291,7 +1291,7 @@
               <w:tab w:val="right" w:leader="dot" w:pos="9628"/>
             </w:tabs>
             <w:rPr>
-              <w:rFonts w:asciiTheme="minorHAnsi" w:eastAsiaTheme="minorEastAsia" w:hAnsiTheme="minorHAnsi" w:cstheme="minorBidi"/>
+              <w:rFonts w:eastAsiaTheme="minorEastAsia"/>
               <w:noProof/>
               <w:kern w:val="2"/>
               <w:sz w:val="24"/>
@@ -1357,7 +1357,7 @@
               <w:tab w:val="right" w:leader="dot" w:pos="9628"/>
             </w:tabs>
             <w:rPr>
-              <w:rFonts w:asciiTheme="minorHAnsi" w:eastAsiaTheme="minorEastAsia" w:hAnsiTheme="minorHAnsi" w:cstheme="minorBidi"/>
+              <w:rFonts w:eastAsiaTheme="minorEastAsia"/>
               <w:noProof/>
               <w:kern w:val="2"/>
               <w:sz w:val="24"/>
@@ -1431,7 +1431,7 @@
               <w:tab w:val="right" w:leader="dot" w:pos="9628"/>
             </w:tabs>
             <w:rPr>
-              <w:rFonts w:asciiTheme="minorHAnsi" w:eastAsiaTheme="minorEastAsia" w:hAnsiTheme="minorHAnsi" w:cstheme="minorBidi"/>
+              <w:rFonts w:eastAsiaTheme="minorEastAsia"/>
               <w:noProof/>
               <w:kern w:val="2"/>
               <w:sz w:val="24"/>
@@ -1497,7 +1497,7 @@
               <w:tab w:val="right" w:leader="dot" w:pos="9628"/>
             </w:tabs>
             <w:rPr>
-              <w:rFonts w:asciiTheme="minorHAnsi" w:eastAsiaTheme="minorEastAsia" w:hAnsiTheme="minorHAnsi" w:cstheme="minorBidi"/>
+              <w:rFonts w:eastAsiaTheme="minorEastAsia"/>
               <w:noProof/>
               <w:kern w:val="2"/>
               <w:sz w:val="24"/>
@@ -1563,7 +1563,7 @@
               <w:tab w:val="right" w:leader="dot" w:pos="9628"/>
             </w:tabs>
             <w:rPr>
-              <w:rFonts w:asciiTheme="minorHAnsi" w:eastAsiaTheme="minorEastAsia" w:hAnsiTheme="minorHAnsi" w:cstheme="minorBidi"/>
+              <w:rFonts w:eastAsiaTheme="minorEastAsia"/>
               <w:noProof/>
               <w:kern w:val="2"/>
               <w:sz w:val="24"/>
@@ -1629,7 +1629,7 @@
               <w:tab w:val="right" w:leader="dot" w:pos="9628"/>
             </w:tabs>
             <w:rPr>
-              <w:rFonts w:asciiTheme="minorHAnsi" w:eastAsiaTheme="minorEastAsia" w:hAnsiTheme="minorHAnsi" w:cstheme="minorBidi"/>
+              <w:rFonts w:eastAsiaTheme="minorEastAsia"/>
               <w:noProof/>
               <w:kern w:val="2"/>
               <w:sz w:val="24"/>
@@ -1695,7 +1695,7 @@
               <w:tab w:val="right" w:leader="dot" w:pos="9628"/>
             </w:tabs>
             <w:rPr>
-              <w:rFonts w:asciiTheme="minorHAnsi" w:eastAsiaTheme="minorEastAsia" w:hAnsiTheme="minorHAnsi" w:cstheme="minorBidi"/>
+              <w:rFonts w:eastAsiaTheme="minorEastAsia"/>
               <w:noProof/>
               <w:kern w:val="2"/>
               <w:sz w:val="24"/>
@@ -1761,7 +1761,7 @@
               <w:tab w:val="right" w:leader="dot" w:pos="9628"/>
             </w:tabs>
             <w:rPr>
-              <w:rFonts w:asciiTheme="minorHAnsi" w:eastAsiaTheme="minorEastAsia" w:hAnsiTheme="minorHAnsi" w:cstheme="minorBidi"/>
+              <w:rFonts w:eastAsiaTheme="minorEastAsia"/>
               <w:noProof/>
               <w:kern w:val="2"/>
               <w:sz w:val="24"/>
@@ -1827,7 +1827,7 @@
               <w:tab w:val="right" w:leader="dot" w:pos="9628"/>
             </w:tabs>
             <w:rPr>
-              <w:rFonts w:asciiTheme="minorHAnsi" w:eastAsiaTheme="minorEastAsia" w:hAnsiTheme="minorHAnsi" w:cstheme="minorBidi"/>
+              <w:rFonts w:eastAsiaTheme="minorEastAsia"/>
               <w:noProof/>
               <w:kern w:val="2"/>
               <w:sz w:val="24"/>
@@ -1893,7 +1893,7 @@
               <w:tab w:val="right" w:leader="dot" w:pos="9628"/>
             </w:tabs>
             <w:rPr>
-              <w:rFonts w:asciiTheme="minorHAnsi" w:eastAsiaTheme="minorEastAsia" w:hAnsiTheme="minorHAnsi" w:cstheme="minorBidi"/>
+              <w:rFonts w:eastAsiaTheme="minorEastAsia"/>
               <w:noProof/>
               <w:kern w:val="2"/>
               <w:sz w:val="24"/>
@@ -1959,7 +1959,7 @@
               <w:tab w:val="right" w:leader="dot" w:pos="9628"/>
             </w:tabs>
             <w:rPr>
-              <w:rFonts w:asciiTheme="minorHAnsi" w:eastAsiaTheme="minorEastAsia" w:hAnsiTheme="minorHAnsi" w:cstheme="minorBidi"/>
+              <w:rFonts w:eastAsiaTheme="minorEastAsia"/>
               <w:noProof/>
               <w:kern w:val="2"/>
               <w:sz w:val="24"/>
@@ -2025,7 +2025,7 @@
               <w:tab w:val="right" w:leader="dot" w:pos="9628"/>
             </w:tabs>
             <w:rPr>
-              <w:rFonts w:asciiTheme="minorHAnsi" w:eastAsiaTheme="minorEastAsia" w:hAnsiTheme="minorHAnsi" w:cstheme="minorBidi"/>
+              <w:rFonts w:eastAsiaTheme="minorEastAsia"/>
               <w:noProof/>
               <w:kern w:val="2"/>
               <w:sz w:val="24"/>
@@ -14373,10 +14373,10 @@
         <w:tblLook w:val="0000" w:firstRow="0" w:lastRow="0" w:firstColumn="0" w:lastColumn="0" w:noHBand="0" w:noVBand="0"/>
       </w:tblPr>
       <w:tblGrid>
-        <w:gridCol w:w="1333"/>
-        <w:gridCol w:w="2542"/>
-        <w:gridCol w:w="3340"/>
-        <w:gridCol w:w="2423"/>
+        <w:gridCol w:w="1428"/>
+        <w:gridCol w:w="2620"/>
+        <w:gridCol w:w="3601"/>
+        <w:gridCol w:w="2439"/>
       </w:tblGrid>
       <w:tr>
         <w:trPr>
@@ -14384,7 +14384,7 @@
         </w:trPr>
         <w:tc>
           <w:tcPr>
-            <w:tcW w:w="1333" w:type="dxa"/>
+            <w:tcW w:w="1428" w:type="dxa"/>
             <w:tcBorders>
               <w:top w:val="single" w:sz="4" w:space="0" w:color="999999"/>
               <w:left w:val="single" w:sz="4" w:space="0" w:color="999999"/>
@@ -14398,21 +14398,16 @@
               <w:bottom w:w="60" w:type="dxa"/>
               <w:right w:w="100" w:type="dxa"/>
             </w:tcMar>
-          </w:tcPr>
-          <w:p>
-            <w:pPr>
-              <w:spacing w:after="20"/>
-              <w:rPr>
-                <w:sz w:val="24"/>
-                <w:szCs w:val="24"/>
-              </w:rPr>
+            <w:vAlign w:val="center"/>
+          </w:tcPr>
+          <w:p>
+            <w:pPr>
+              <w:spacing w:after="20"/>
             </w:pPr>
             <w:r>
               <w:rPr>
                 <w:b/>
                 <w:bCs/>
-                <w:sz w:val="24"/>
-                <w:szCs w:val="24"/>
               </w:rPr>
               <w:t>Công cụ</w:t>
             </w:r>
@@ -14420,7 +14415,7 @@
         </w:tc>
         <w:tc>
           <w:tcPr>
-            <w:tcW w:w="2542" w:type="dxa"/>
+            <w:tcW w:w="2503" w:type="dxa"/>
             <w:tcBorders>
               <w:top w:val="single" w:sz="4" w:space="0" w:color="999999"/>
               <w:left w:val="single" w:sz="4" w:space="0" w:color="999999"/>
@@ -14434,21 +14429,16 @@
               <w:bottom w:w="60" w:type="dxa"/>
               <w:right w:w="100" w:type="dxa"/>
             </w:tcMar>
-          </w:tcPr>
-          <w:p>
-            <w:pPr>
-              <w:spacing w:after="20"/>
-              <w:rPr>
-                <w:sz w:val="24"/>
-                <w:szCs w:val="24"/>
-              </w:rPr>
+            <w:vAlign w:val="center"/>
+          </w:tcPr>
+          <w:p>
+            <w:pPr>
+              <w:spacing w:after="20"/>
             </w:pPr>
             <w:r>
               <w:rPr>
                 <w:b/>
                 <w:bCs/>
-                <w:sz w:val="24"/>
-                <w:szCs w:val="24"/>
               </w:rPr>
               <w:t>Dùng vào việc gì</w:t>
             </w:r>
@@ -14470,21 +14460,16 @@
               <w:bottom w:w="60" w:type="dxa"/>
               <w:right w:w="100" w:type="dxa"/>
             </w:tcMar>
-          </w:tcPr>
-          <w:p>
-            <w:pPr>
-              <w:spacing w:after="20"/>
-              <w:rPr>
-                <w:sz w:val="24"/>
-                <w:szCs w:val="24"/>
-              </w:rPr>
+            <w:vAlign w:val="center"/>
+          </w:tcPr>
+          <w:p>
+            <w:pPr>
+              <w:spacing w:after="20"/>
             </w:pPr>
             <w:r>
               <w:rPr>
                 <w:b/>
                 <w:bCs/>
-                <w:sz w:val="24"/>
-                <w:szCs w:val="24"/>
               </w:rPr>
               <w:t>Áp dụng ở tệp / hàm nào</w:t>
             </w:r>
@@ -14492,7 +14477,7 @@
         </w:tc>
         <w:tc>
           <w:tcPr>
-            <w:tcW w:w="2423" w:type="dxa"/>
+            <w:tcW w:w="2367" w:type="dxa"/>
             <w:tcBorders>
               <w:top w:val="single" w:sz="4" w:space="0" w:color="999999"/>
               <w:left w:val="single" w:sz="4" w:space="0" w:color="999999"/>
@@ -14506,21 +14491,16 @@
               <w:bottom w:w="60" w:type="dxa"/>
               <w:right w:w="100" w:type="dxa"/>
             </w:tcMar>
-          </w:tcPr>
-          <w:p>
-            <w:pPr>
-              <w:spacing w:after="20"/>
-              <w:rPr>
-                <w:sz w:val="24"/>
-                <w:szCs w:val="24"/>
-              </w:rPr>
+            <w:vAlign w:val="center"/>
+          </w:tcPr>
+          <w:p>
+            <w:pPr>
+              <w:spacing w:after="20"/>
             </w:pPr>
             <w:r>
               <w:rPr>
                 <w:b/>
                 <w:bCs/>
-                <w:sz w:val="24"/>
-                <w:szCs w:val="24"/>
               </w:rPr>
               <w:t>Em đã kiểm chứng thế nào</w:t>
             </w:r>
@@ -14530,67 +14510,53 @@
       <w:tr>
         <w:tc>
           <w:tcPr>
-            <w:tcW w:w="1333" w:type="dxa"/>
-            <w:tcBorders>
-              <w:top w:val="single" w:sz="4" w:space="0" w:color="999999"/>
-              <w:left w:val="single" w:sz="4" w:space="0" w:color="999999"/>
-              <w:bottom w:val="single" w:sz="4" w:space="0" w:color="999999"/>
-              <w:right w:val="single" w:sz="4" w:space="0" w:color="999999"/>
-            </w:tcBorders>
-            <w:tcMar>
-              <w:top w:w="60" w:type="dxa"/>
-              <w:left w:w="100" w:type="dxa"/>
-              <w:bottom w:w="60" w:type="dxa"/>
-              <w:right w:w="100" w:type="dxa"/>
-            </w:tcMar>
-          </w:tcPr>
-          <w:p>
-            <w:pPr>
-              <w:spacing w:after="20"/>
-              <w:rPr>
-                <w:sz w:val="24"/>
-                <w:szCs w:val="24"/>
-              </w:rPr>
-            </w:pPr>
-            <w:r>
-              <w:rPr>
-                <w:sz w:val="24"/>
-                <w:szCs w:val="24"/>
-              </w:rPr>
-              <w:t>Claude (Anthropic)</w:t>
-            </w:r>
-          </w:p>
-        </w:tc>
-        <w:tc>
-          <w:tcPr>
-            <w:tcW w:w="2542" w:type="dxa"/>
-            <w:tcBorders>
-              <w:top w:val="single" w:sz="4" w:space="0" w:color="999999"/>
-              <w:left w:val="single" w:sz="4" w:space="0" w:color="999999"/>
-              <w:bottom w:val="single" w:sz="4" w:space="0" w:color="999999"/>
-              <w:right w:val="single" w:sz="4" w:space="0" w:color="999999"/>
-            </w:tcBorders>
-            <w:tcMar>
-              <w:top w:w="60" w:type="dxa"/>
-              <w:left w:w="100" w:type="dxa"/>
-              <w:bottom w:w="60" w:type="dxa"/>
-              <w:right w:w="100" w:type="dxa"/>
-            </w:tcMar>
-          </w:tcPr>
-          <w:p>
-            <w:pPr>
-              <w:spacing w:after="20"/>
-              <w:rPr>
-                <w:sz w:val="24"/>
-                <w:szCs w:val="24"/>
-              </w:rPr>
-            </w:pPr>
-            <w:r>
-              <w:rPr>
-                <w:sz w:val="24"/>
-                <w:szCs w:val="24"/>
-              </w:rPr>
-              <w:t>Hướng dẫn cài Ruby, PostgreSQL, tạo project Rails 8.1; đọc lỗi khi cài</w:t>
+            <w:tcW w:w="1428" w:type="dxa"/>
+            <w:tcBorders>
+              <w:top w:val="single" w:sz="4" w:space="0" w:color="999999"/>
+              <w:left w:val="single" w:sz="4" w:space="0" w:color="999999"/>
+              <w:bottom w:val="single" w:sz="4" w:space="0" w:color="999999"/>
+              <w:right w:val="single" w:sz="4" w:space="0" w:color="999999"/>
+            </w:tcBorders>
+            <w:tcMar>
+              <w:top w:w="60" w:type="dxa"/>
+              <w:left w:w="100" w:type="dxa"/>
+              <w:bottom w:w="60" w:type="dxa"/>
+              <w:right w:w="100" w:type="dxa"/>
+            </w:tcMar>
+            <w:vAlign w:val="center"/>
+          </w:tcPr>
+          <w:p>
+            <w:pPr>
+              <w:spacing w:after="20"/>
+            </w:pPr>
+            <w:r>
+              <w:t>ChatGPT (OpenAI)</w:t>
+            </w:r>
+          </w:p>
+        </w:tc>
+        <w:tc>
+          <w:tcPr>
+            <w:tcW w:w="2503" w:type="dxa"/>
+            <w:tcBorders>
+              <w:top w:val="single" w:sz="4" w:space="0" w:color="999999"/>
+              <w:left w:val="single" w:sz="4" w:space="0" w:color="999999"/>
+              <w:bottom w:val="single" w:sz="4" w:space="0" w:color="999999"/>
+              <w:right w:val="single" w:sz="4" w:space="0" w:color="999999"/>
+            </w:tcBorders>
+            <w:tcMar>
+              <w:top w:w="60" w:type="dxa"/>
+              <w:left w:w="100" w:type="dxa"/>
+              <w:bottom w:w="60" w:type="dxa"/>
+              <w:right w:w="100" w:type="dxa"/>
+            </w:tcMar>
+            <w:vAlign w:val="center"/>
+          </w:tcPr>
+          <w:p>
+            <w:pPr>
+              <w:spacing w:after="20"/>
+            </w:pPr>
+            <w:r>
+              <w:t>BT1 – Hỗ trợ xây dựng SRS rút gọn luồng L2: yêu cầu chức năng, phi chức năng, quy tắc nghiệp vụ</w:t>
             </w:r>
           </w:p>
         </w:tc>
@@ -14609,54 +14575,49 @@
               <w:bottom w:w="60" w:type="dxa"/>
               <w:right w:w="100" w:type="dxa"/>
             </w:tcMar>
-          </w:tcPr>
-          <w:p>
-            <w:pPr>
-              <w:spacing w:after="20"/>
-              <w:rPr>
-                <w:sz w:val="24"/>
-                <w:szCs w:val="24"/>
-              </w:rPr>
-            </w:pPr>
-            <w:r>
-              <w:rPr>
-                <w:sz w:val="24"/>
-                <w:szCs w:val="24"/>
-              </w:rPr>
-              <w:t>Môi trường; src/Gemfile, src/config/database.yml</w:t>
-            </w:r>
-          </w:p>
-        </w:tc>
-        <w:tc>
-          <w:tcPr>
-            <w:tcW w:w="2423" w:type="dxa"/>
-            <w:tcBorders>
-              <w:top w:val="single" w:sz="4" w:space="0" w:color="999999"/>
-              <w:left w:val="single" w:sz="4" w:space="0" w:color="999999"/>
-              <w:bottom w:val="single" w:sz="4" w:space="0" w:color="999999"/>
-              <w:right w:val="single" w:sz="4" w:space="0" w:color="999999"/>
-            </w:tcBorders>
-            <w:tcMar>
-              <w:top w:w="60" w:type="dxa"/>
-              <w:left w:w="100" w:type="dxa"/>
-              <w:bottom w:w="60" w:type="dxa"/>
-              <w:right w:w="100" w:type="dxa"/>
-            </w:tcMar>
-          </w:tcPr>
-          <w:p>
-            <w:pPr>
-              <w:spacing w:after="20"/>
-              <w:rPr>
-                <w:sz w:val="24"/>
-                <w:szCs w:val="24"/>
-              </w:rPr>
-            </w:pPr>
-            <w:r>
-              <w:rPr>
-                <w:sz w:val="24"/>
-                <w:szCs w:val="24"/>
-              </w:rPr>
-              <w:t>Tự chạy từng lệnh trên WSL, sửa đến khi bin/rails server chạy</w:t>
+            <w:vAlign w:val="center"/>
+          </w:tcPr>
+          <w:p>
+            <w:pPr>
+              <w:spacing w:after="20"/>
+            </w:pPr>
+            <w:r>
+              <w:t xml:space="preserve">Báo cáo BT1 Mục 1; </w:t>
+            </w:r>
+            <w:r>
+              <w:rPr>
+                <w:rStyle w:val="HTMLCode"/>
+                <w:rFonts w:ascii="Times New Roman" w:hAnsi="Times New Roman" w:cs="Times New Roman"/>
+                <w:sz w:val="26"/>
+                <w:szCs w:val="26"/>
+              </w:rPr>
+              <w:t>docs/srs.md</w:t>
+            </w:r>
+          </w:p>
+        </w:tc>
+        <w:tc>
+          <w:tcPr>
+            <w:tcW w:w="2367" w:type="dxa"/>
+            <w:tcBorders>
+              <w:top w:val="single" w:sz="4" w:space="0" w:color="999999"/>
+              <w:left w:val="single" w:sz="4" w:space="0" w:color="999999"/>
+              <w:bottom w:val="single" w:sz="4" w:space="0" w:color="999999"/>
+              <w:right w:val="single" w:sz="4" w:space="0" w:color="999999"/>
+            </w:tcBorders>
+            <w:tcMar>
+              <w:top w:w="60" w:type="dxa"/>
+              <w:left w:w="100" w:type="dxa"/>
+              <w:bottom w:w="60" w:type="dxa"/>
+              <w:right w:w="100" w:type="dxa"/>
+            </w:tcMar>
+            <w:vAlign w:val="center"/>
+          </w:tcPr>
+          <w:p>
+            <w:pPr>
+              <w:spacing w:after="20"/>
+            </w:pPr>
+            <w:r>
+              <w:t>Chỉnh theo phạm vi L2; rà soát mã FR, NFR, BR và bảng truy vết User Story – FR – Use Case</w:t>
             </w:r>
           </w:p>
         </w:tc>
@@ -14664,67 +14625,53 @@
       <w:tr>
         <w:tc>
           <w:tcPr>
-            <w:tcW w:w="1333" w:type="dxa"/>
-            <w:tcBorders>
-              <w:top w:val="single" w:sz="4" w:space="0" w:color="999999"/>
-              <w:left w:val="single" w:sz="4" w:space="0" w:color="999999"/>
-              <w:bottom w:val="single" w:sz="4" w:space="0" w:color="999999"/>
-              <w:right w:val="single" w:sz="4" w:space="0" w:color="999999"/>
-            </w:tcBorders>
-            <w:tcMar>
-              <w:top w:w="60" w:type="dxa"/>
-              <w:left w:w="100" w:type="dxa"/>
-              <w:bottom w:w="60" w:type="dxa"/>
-              <w:right w:w="100" w:type="dxa"/>
-            </w:tcMar>
-          </w:tcPr>
-          <w:p>
-            <w:pPr>
-              <w:spacing w:after="20"/>
-              <w:rPr>
-                <w:sz w:val="24"/>
-                <w:szCs w:val="24"/>
-              </w:rPr>
-            </w:pPr>
-            <w:r>
-              <w:rPr>
-                <w:sz w:val="24"/>
-                <w:szCs w:val="24"/>
-              </w:rPr>
-              <w:t>Claude</w:t>
-            </w:r>
-          </w:p>
-        </w:tc>
-        <w:tc>
-          <w:tcPr>
-            <w:tcW w:w="2542" w:type="dxa"/>
-            <w:tcBorders>
-              <w:top w:val="single" w:sz="4" w:space="0" w:color="999999"/>
-              <w:left w:val="single" w:sz="4" w:space="0" w:color="999999"/>
-              <w:bottom w:val="single" w:sz="4" w:space="0" w:color="999999"/>
-              <w:right w:val="single" w:sz="4" w:space="0" w:color="999999"/>
-            </w:tcBorders>
-            <w:tcMar>
-              <w:top w:w="60" w:type="dxa"/>
-              <w:left w:w="100" w:type="dxa"/>
-              <w:bottom w:w="60" w:type="dxa"/>
-              <w:right w:w="100" w:type="dxa"/>
-            </w:tcMar>
-          </w:tcPr>
-          <w:p>
-            <w:pPr>
-              <w:spacing w:after="20"/>
-              <w:rPr>
-                <w:sz w:val="24"/>
-                <w:szCs w:val="24"/>
-              </w:rPr>
-            </w:pPr>
-            <w:r>
-              <w:rPr>
-                <w:sz w:val="24"/>
-                <w:szCs w:val="24"/>
-              </w:rPr>
-              <w:t>Gợi ý migration, ràng buộc CHECK/UNIQUE/FK, seed</w:t>
+            <w:tcW w:w="1428" w:type="dxa"/>
+            <w:tcBorders>
+              <w:top w:val="single" w:sz="4" w:space="0" w:color="999999"/>
+              <w:left w:val="single" w:sz="4" w:space="0" w:color="999999"/>
+              <w:bottom w:val="single" w:sz="4" w:space="0" w:color="999999"/>
+              <w:right w:val="single" w:sz="4" w:space="0" w:color="999999"/>
+            </w:tcBorders>
+            <w:tcMar>
+              <w:top w:w="60" w:type="dxa"/>
+              <w:left w:w="100" w:type="dxa"/>
+              <w:bottom w:w="60" w:type="dxa"/>
+              <w:right w:w="100" w:type="dxa"/>
+            </w:tcMar>
+            <w:vAlign w:val="center"/>
+          </w:tcPr>
+          <w:p>
+            <w:pPr>
+              <w:spacing w:after="20"/>
+            </w:pPr>
+            <w:r>
+              <w:t>ChatGPT</w:t>
+            </w:r>
+          </w:p>
+        </w:tc>
+        <w:tc>
+          <w:tcPr>
+            <w:tcW w:w="2503" w:type="dxa"/>
+            <w:tcBorders>
+              <w:top w:val="single" w:sz="4" w:space="0" w:color="999999"/>
+              <w:left w:val="single" w:sz="4" w:space="0" w:color="999999"/>
+              <w:bottom w:val="single" w:sz="4" w:space="0" w:color="999999"/>
+              <w:right w:val="single" w:sz="4" w:space="0" w:color="999999"/>
+            </w:tcBorders>
+            <w:tcMar>
+              <w:top w:w="60" w:type="dxa"/>
+              <w:left w:w="100" w:type="dxa"/>
+              <w:bottom w:w="60" w:type="dxa"/>
+              <w:right w:w="100" w:type="dxa"/>
+            </w:tcMar>
+            <w:vAlign w:val="center"/>
+          </w:tcPr>
+          <w:p>
+            <w:pPr>
+              <w:spacing w:after="20"/>
+            </w:pPr>
+            <w:r>
+              <w:t>BT1 – Hỗ trợ xác định use case và quan hệ include/extend</w:t>
             </w:r>
           </w:p>
         </w:tc>
@@ -14743,54 +14690,40 @@
               <w:bottom w:w="60" w:type="dxa"/>
               <w:right w:w="100" w:type="dxa"/>
             </w:tcMar>
-          </w:tcPr>
-          <w:p>
-            <w:pPr>
-              <w:spacing w:after="20"/>
-              <w:rPr>
-                <w:sz w:val="24"/>
-                <w:szCs w:val="24"/>
-              </w:rPr>
-            </w:pPr>
-            <w:r>
-              <w:rPr>
-                <w:sz w:val="24"/>
-                <w:szCs w:val="24"/>
-              </w:rPr>
-              <w:t>src/db/migrate/*, src/db/seeds.rb, db/schema.sql</w:t>
-            </w:r>
-          </w:p>
-        </w:tc>
-        <w:tc>
-          <w:tcPr>
-            <w:tcW w:w="2423" w:type="dxa"/>
-            <w:tcBorders>
-              <w:top w:val="single" w:sz="4" w:space="0" w:color="999999"/>
-              <w:left w:val="single" w:sz="4" w:space="0" w:color="999999"/>
-              <w:bottom w:val="single" w:sz="4" w:space="0" w:color="999999"/>
-              <w:right w:val="single" w:sz="4" w:space="0" w:color="999999"/>
-            </w:tcBorders>
-            <w:tcMar>
-              <w:top w:w="60" w:type="dxa"/>
-              <w:left w:w="100" w:type="dxa"/>
-              <w:bottom w:w="60" w:type="dxa"/>
-              <w:right w:w="100" w:type="dxa"/>
-            </w:tcMar>
-          </w:tcPr>
-          <w:p>
-            <w:pPr>
-              <w:spacing w:after="20"/>
-              <w:rPr>
-                <w:sz w:val="24"/>
-                <w:szCs w:val="24"/>
-              </w:rPr>
-            </w:pPr>
-            <w:r>
-              <w:rPr>
-                <w:sz w:val="24"/>
-                <w:szCs w:val="24"/>
-              </w:rPr>
-              <w:t>db:prepare trên CSDL trống; seed 2 lần so sánh số bản ghi; nạp schema.sql bằng psql</w:t>
+            <w:vAlign w:val="center"/>
+          </w:tcPr>
+          <w:p>
+            <w:pPr>
+              <w:spacing w:after="20"/>
+            </w:pPr>
+            <w:r>
+              <w:t>Báo cáo BT1 Mục 2; sơ đồ Use Case</w:t>
+            </w:r>
+          </w:p>
+        </w:tc>
+        <w:tc>
+          <w:tcPr>
+            <w:tcW w:w="2367" w:type="dxa"/>
+            <w:tcBorders>
+              <w:top w:val="single" w:sz="4" w:space="0" w:color="999999"/>
+              <w:left w:val="single" w:sz="4" w:space="0" w:color="999999"/>
+              <w:bottom w:val="single" w:sz="4" w:space="0" w:color="999999"/>
+              <w:right w:val="single" w:sz="4" w:space="0" w:color="999999"/>
+            </w:tcBorders>
+            <w:tcMar>
+              <w:top w:w="60" w:type="dxa"/>
+              <w:left w:w="100" w:type="dxa"/>
+              <w:bottom w:w="60" w:type="dxa"/>
+              <w:right w:w="100" w:type="dxa"/>
+            </w:tcMar>
+            <w:vAlign w:val="center"/>
+          </w:tcPr>
+          <w:p>
+            <w:pPr>
+              <w:spacing w:after="20"/>
+            </w:pPr>
+            <w:r>
+              <w:t>Đối chiếu với chức năng trong SRS; rà soát vai trò UC01–UC08 và điều kiện xảy ra UC08</w:t>
             </w:r>
           </w:p>
         </w:tc>
@@ -14798,67 +14731,53 @@
       <w:tr>
         <w:tc>
           <w:tcPr>
-            <w:tcW w:w="1333" w:type="dxa"/>
-            <w:tcBorders>
-              <w:top w:val="single" w:sz="4" w:space="0" w:color="999999"/>
-              <w:left w:val="single" w:sz="4" w:space="0" w:color="999999"/>
-              <w:bottom w:val="single" w:sz="4" w:space="0" w:color="999999"/>
-              <w:right w:val="single" w:sz="4" w:space="0" w:color="999999"/>
-            </w:tcBorders>
-            <w:tcMar>
-              <w:top w:w="60" w:type="dxa"/>
-              <w:left w:w="100" w:type="dxa"/>
-              <w:bottom w:w="60" w:type="dxa"/>
-              <w:right w:w="100" w:type="dxa"/>
-            </w:tcMar>
-          </w:tcPr>
-          <w:p>
-            <w:pPr>
-              <w:spacing w:after="20"/>
-              <w:rPr>
-                <w:sz w:val="24"/>
-                <w:szCs w:val="24"/>
-              </w:rPr>
-            </w:pPr>
-            <w:r>
-              <w:rPr>
-                <w:sz w:val="24"/>
-                <w:szCs w:val="24"/>
-              </w:rPr>
-              <w:t>Claude</w:t>
-            </w:r>
-          </w:p>
-        </w:tc>
-        <w:tc>
-          <w:tcPr>
-            <w:tcW w:w="2542" w:type="dxa"/>
-            <w:tcBorders>
-              <w:top w:val="single" w:sz="4" w:space="0" w:color="999999"/>
-              <w:left w:val="single" w:sz="4" w:space="0" w:color="999999"/>
-              <w:bottom w:val="single" w:sz="4" w:space="0" w:color="999999"/>
-              <w:right w:val="single" w:sz="4" w:space="0" w:color="999999"/>
-            </w:tcBorders>
-            <w:tcMar>
-              <w:top w:w="60" w:type="dxa"/>
-              <w:left w:w="100" w:type="dxa"/>
-              <w:bottom w:w="60" w:type="dxa"/>
-              <w:right w:w="100" w:type="dxa"/>
-            </w:tcMar>
-          </w:tcPr>
-          <w:p>
-            <w:pPr>
-              <w:spacing w:after="20"/>
-              <w:rPr>
-                <w:sz w:val="24"/>
-                <w:szCs w:val="24"/>
-              </w:rPr>
-            </w:pPr>
-            <w:r>
-              <w:rPr>
-                <w:sz w:val="24"/>
-                <w:szCs w:val="24"/>
-              </w:rPr>
-              <w:t>Gợi ý service nghiệp vụ</w:t>
+            <w:tcW w:w="1428" w:type="dxa"/>
+            <w:tcBorders>
+              <w:top w:val="single" w:sz="4" w:space="0" w:color="999999"/>
+              <w:left w:val="single" w:sz="4" w:space="0" w:color="999999"/>
+              <w:bottom w:val="single" w:sz="4" w:space="0" w:color="999999"/>
+              <w:right w:val="single" w:sz="4" w:space="0" w:color="999999"/>
+            </w:tcBorders>
+            <w:tcMar>
+              <w:top w:w="60" w:type="dxa"/>
+              <w:left w:w="100" w:type="dxa"/>
+              <w:bottom w:w="60" w:type="dxa"/>
+              <w:right w:w="100" w:type="dxa"/>
+            </w:tcMar>
+            <w:vAlign w:val="center"/>
+          </w:tcPr>
+          <w:p>
+            <w:pPr>
+              <w:spacing w:after="20"/>
+            </w:pPr>
+            <w:r>
+              <w:t>ChatGPT</w:t>
+            </w:r>
+          </w:p>
+        </w:tc>
+        <w:tc>
+          <w:tcPr>
+            <w:tcW w:w="2503" w:type="dxa"/>
+            <w:tcBorders>
+              <w:top w:val="single" w:sz="4" w:space="0" w:color="999999"/>
+              <w:left w:val="single" w:sz="4" w:space="0" w:color="999999"/>
+              <w:bottom w:val="single" w:sz="4" w:space="0" w:color="999999"/>
+              <w:right w:val="single" w:sz="4" w:space="0" w:color="999999"/>
+            </w:tcBorders>
+            <w:tcMar>
+              <w:top w:w="60" w:type="dxa"/>
+              <w:left w:w="100" w:type="dxa"/>
+              <w:bottom w:w="60" w:type="dxa"/>
+              <w:right w:w="100" w:type="dxa"/>
+            </w:tcMar>
+            <w:vAlign w:val="center"/>
+          </w:tcPr>
+          <w:p>
+            <w:pPr>
+              <w:spacing w:after="20"/>
+            </w:pPr>
+            <w:r>
+              <w:t>BT1 – Hỗ trợ trình bày kiến trúc MVC + Service Layer trên Rails và PostgreSQL</w:t>
             </w:r>
           </w:p>
         </w:tc>
@@ -14877,70 +14796,49 @@
               <w:bottom w:w="60" w:type="dxa"/>
               <w:right w:w="100" w:type="dxa"/>
             </w:tcMar>
-          </w:tcPr>
-          <w:p>
-            <w:pPr>
-              <w:spacing w:after="20"/>
-              <w:rPr>
-                <w:sz w:val="24"/>
-                <w:szCs w:val="24"/>
-              </w:rPr>
-            </w:pPr>
-            <w:r>
-              <w:rPr>
-                <w:sz w:val="24"/>
-                <w:szCs w:val="24"/>
-              </w:rPr>
-              <w:t>WarrantyRequestCreator, RequestCodeGenerator, SlaDeadlineCalculator, WarrantyRequestStatusChanger, CustomerService, IssueCategoryService</w:t>
-            </w:r>
-          </w:p>
-        </w:tc>
-        <w:tc>
-          <w:tcPr>
-            <w:tcW w:w="2423" w:type="dxa"/>
-            <w:tcBorders>
-              <w:top w:val="single" w:sz="4" w:space="0" w:color="999999"/>
-              <w:left w:val="single" w:sz="4" w:space="0" w:color="999999"/>
-              <w:bottom w:val="single" w:sz="4" w:space="0" w:color="999999"/>
-              <w:right w:val="single" w:sz="4" w:space="0" w:color="999999"/>
-            </w:tcBorders>
-            <w:tcMar>
-              <w:top w:w="60" w:type="dxa"/>
-              <w:left w:w="100" w:type="dxa"/>
-              <w:bottom w:w="60" w:type="dxa"/>
-              <w:right w:w="100" w:type="dxa"/>
-            </w:tcMar>
-          </w:tcPr>
-          <w:p>
-            <w:pPr>
-              <w:spacing w:after="20"/>
-              <w:rPr>
-                <w:sz w:val="24"/>
-                <w:szCs w:val="24"/>
-                <w:lang w:val="vi-VN"/>
-              </w:rPr>
-            </w:pPr>
-            <w:r>
-              <w:rPr>
-                <w:sz w:val="24"/>
-                <w:szCs w:val="24"/>
-              </w:rPr>
-              <w:t>Chạy test service; thử bằng Postman các trường hợp 201/400/409/</w:t>
-            </w:r>
-            <w:r>
-              <w:rPr>
-                <w:sz w:val="24"/>
-                <w:szCs w:val="24"/>
-              </w:rPr>
-              <w:t>422</w:t>
-            </w:r>
-            <w:r>
-              <w:rPr>
-                <w:sz w:val="24"/>
-                <w:szCs w:val="24"/>
-                <w:lang w:val="vi-VN"/>
-              </w:rPr>
-              <w:t>/503</w:t>
+            <w:vAlign w:val="center"/>
+          </w:tcPr>
+          <w:p>
+            <w:pPr>
+              <w:spacing w:after="20"/>
+            </w:pPr>
+            <w:r>
+              <w:t xml:space="preserve">Báo cáo BT1 Mục 3; </w:t>
+            </w:r>
+            <w:r>
+              <w:rPr>
+                <w:rStyle w:val="HTMLCode"/>
+                <w:rFonts w:ascii="Times New Roman" w:hAnsi="Times New Roman" w:cs="Times New Roman"/>
+                <w:sz w:val="26"/>
+                <w:szCs w:val="26"/>
+              </w:rPr>
+              <w:t>docs/architecture.drawio</w:t>
+            </w:r>
+          </w:p>
+        </w:tc>
+        <w:tc>
+          <w:tcPr>
+            <w:tcW w:w="2367" w:type="dxa"/>
+            <w:tcBorders>
+              <w:top w:val="single" w:sz="4" w:space="0" w:color="999999"/>
+              <w:left w:val="single" w:sz="4" w:space="0" w:color="999999"/>
+              <w:bottom w:val="single" w:sz="4" w:space="0" w:color="999999"/>
+              <w:right w:val="single" w:sz="4" w:space="0" w:color="999999"/>
+            </w:tcBorders>
+            <w:tcMar>
+              <w:top w:w="60" w:type="dxa"/>
+              <w:left w:w="100" w:type="dxa"/>
+              <w:bottom w:w="60" w:type="dxa"/>
+              <w:right w:w="100" w:type="dxa"/>
+            </w:tcMar>
+            <w:vAlign w:val="center"/>
+          </w:tcPr>
+          <w:p>
+            <w:pPr>
+              <w:spacing w:after="20"/>
+            </w:pPr>
+            <w:r>
+              <w:t>Điều chỉnh lập luận theo kiến trúc đã chọn, gắn từng lựa chọn với NFR cụ thể</w:t>
             </w:r>
           </w:p>
         </w:tc>
@@ -14948,67 +14846,53 @@
       <w:tr>
         <w:tc>
           <w:tcPr>
-            <w:tcW w:w="1333" w:type="dxa"/>
-            <w:tcBorders>
-              <w:top w:val="single" w:sz="4" w:space="0" w:color="999999"/>
-              <w:left w:val="single" w:sz="4" w:space="0" w:color="999999"/>
-              <w:bottom w:val="single" w:sz="4" w:space="0" w:color="999999"/>
-              <w:right w:val="single" w:sz="4" w:space="0" w:color="999999"/>
-            </w:tcBorders>
-            <w:tcMar>
-              <w:top w:w="60" w:type="dxa"/>
-              <w:left w:w="100" w:type="dxa"/>
-              <w:bottom w:w="60" w:type="dxa"/>
-              <w:right w:w="100" w:type="dxa"/>
-            </w:tcMar>
-          </w:tcPr>
-          <w:p>
-            <w:pPr>
-              <w:spacing w:after="20"/>
-              <w:rPr>
-                <w:sz w:val="24"/>
-                <w:szCs w:val="24"/>
-              </w:rPr>
-            </w:pPr>
-            <w:r>
-              <w:rPr>
-                <w:sz w:val="24"/>
-                <w:szCs w:val="24"/>
-              </w:rPr>
-              <w:t>Claude</w:t>
-            </w:r>
-          </w:p>
-        </w:tc>
-        <w:tc>
-          <w:tcPr>
-            <w:tcW w:w="2542" w:type="dxa"/>
-            <w:tcBorders>
-              <w:top w:val="single" w:sz="4" w:space="0" w:color="999999"/>
-              <w:left w:val="single" w:sz="4" w:space="0" w:color="999999"/>
-              <w:bottom w:val="single" w:sz="4" w:space="0" w:color="999999"/>
-              <w:right w:val="single" w:sz="4" w:space="0" w:color="999999"/>
-            </w:tcBorders>
-            <w:tcMar>
-              <w:top w:w="60" w:type="dxa"/>
-              <w:left w:w="100" w:type="dxa"/>
-              <w:bottom w:w="60" w:type="dxa"/>
-              <w:right w:w="100" w:type="dxa"/>
-            </w:tcMar>
-          </w:tcPr>
-          <w:p>
-            <w:pPr>
-              <w:spacing w:after="20"/>
-              <w:rPr>
-                <w:sz w:val="24"/>
-                <w:szCs w:val="24"/>
-              </w:rPr>
-            </w:pPr>
-            <w:r>
-              <w:rPr>
-                <w:sz w:val="24"/>
-                <w:szCs w:val="24"/>
-              </w:rPr>
-              <w:t>Gợi ý làm sạch dữ liệu CSV của giảng viên</w:t>
+            <w:tcW w:w="1428" w:type="dxa"/>
+            <w:tcBorders>
+              <w:top w:val="single" w:sz="4" w:space="0" w:color="999999"/>
+              <w:left w:val="single" w:sz="4" w:space="0" w:color="999999"/>
+              <w:bottom w:val="single" w:sz="4" w:space="0" w:color="999999"/>
+              <w:right w:val="single" w:sz="4" w:space="0" w:color="999999"/>
+            </w:tcBorders>
+            <w:tcMar>
+              <w:top w:w="60" w:type="dxa"/>
+              <w:left w:w="100" w:type="dxa"/>
+              <w:bottom w:w="60" w:type="dxa"/>
+              <w:right w:w="100" w:type="dxa"/>
+            </w:tcMar>
+            <w:vAlign w:val="center"/>
+          </w:tcPr>
+          <w:p>
+            <w:pPr>
+              <w:spacing w:after="20"/>
+            </w:pPr>
+            <w:r>
+              <w:t>ChatGPT</w:t>
+            </w:r>
+          </w:p>
+        </w:tc>
+        <w:tc>
+          <w:tcPr>
+            <w:tcW w:w="2503" w:type="dxa"/>
+            <w:tcBorders>
+              <w:top w:val="single" w:sz="4" w:space="0" w:color="999999"/>
+              <w:left w:val="single" w:sz="4" w:space="0" w:color="999999"/>
+              <w:bottom w:val="single" w:sz="4" w:space="0" w:color="999999"/>
+              <w:right w:val="single" w:sz="4" w:space="0" w:color="999999"/>
+            </w:tcBorders>
+            <w:tcMar>
+              <w:top w:w="60" w:type="dxa"/>
+              <w:left w:w="100" w:type="dxa"/>
+              <w:bottom w:w="60" w:type="dxa"/>
+              <w:right w:w="100" w:type="dxa"/>
+            </w:tcMar>
+            <w:vAlign w:val="center"/>
+          </w:tcPr>
+          <w:p>
+            <w:pPr>
+              <w:spacing w:after="20"/>
+            </w:pPr>
+            <w:r>
+              <w:t>BT1 – Gợi ý bảng, thuộc tính, khóa chính, khóa ngoại cho ERD và SQL DDL</w:t>
             </w:r>
           </w:p>
         </w:tc>
@@ -15027,54 +14911,61 @@
               <w:bottom w:w="60" w:type="dxa"/>
               <w:right w:w="100" w:type="dxa"/>
             </w:tcMar>
-          </w:tcPr>
-          <w:p>
-            <w:pPr>
-              <w:spacing w:after="20"/>
-              <w:rPr>
-                <w:sz w:val="24"/>
-                <w:szCs w:val="24"/>
-              </w:rPr>
-            </w:pPr>
-            <w:r>
-              <w:rPr>
-                <w:sz w:val="24"/>
-                <w:szCs w:val="24"/>
-              </w:rPr>
-              <w:t>CustomerRowNormalizer, CustomerCsvImporter, lib/tasks/import.rake</w:t>
-            </w:r>
-          </w:p>
-        </w:tc>
-        <w:tc>
-          <w:tcPr>
-            <w:tcW w:w="2423" w:type="dxa"/>
-            <w:tcBorders>
-              <w:top w:val="single" w:sz="4" w:space="0" w:color="999999"/>
-              <w:left w:val="single" w:sz="4" w:space="0" w:color="999999"/>
-              <w:bottom w:val="single" w:sz="4" w:space="0" w:color="999999"/>
-              <w:right w:val="single" w:sz="4" w:space="0" w:color="999999"/>
-            </w:tcBorders>
-            <w:tcMar>
-              <w:top w:w="60" w:type="dxa"/>
-              <w:left w:w="100" w:type="dxa"/>
-              <w:bottom w:w="60" w:type="dxa"/>
-              <w:right w:w="100" w:type="dxa"/>
-            </w:tcMar>
-          </w:tcPr>
-          <w:p>
-            <w:pPr>
-              <w:spacing w:after="20"/>
-              <w:rPr>
-                <w:sz w:val="24"/>
-                <w:szCs w:val="24"/>
-              </w:rPr>
-            </w:pPr>
-            <w:r>
-              <w:rPr>
-                <w:sz w:val="24"/>
-                <w:szCs w:val="24"/>
-              </w:rPr>
-              <w:t>Chạy import 2 lần (lần 2 nạp 0); xem tệp customers_reject.csv</w:t>
+            <w:vAlign w:val="center"/>
+          </w:tcPr>
+          <w:p>
+            <w:pPr>
+              <w:spacing w:after="20"/>
+            </w:pPr>
+            <w:r>
+              <w:t xml:space="preserve">Báo cáo BT1 Mục 4; </w:t>
+            </w:r>
+            <w:r>
+              <w:rPr>
+                <w:rStyle w:val="HTMLCode"/>
+                <w:rFonts w:ascii="Times New Roman" w:hAnsi="Times New Roman" w:cs="Times New Roman"/>
+                <w:sz w:val="26"/>
+                <w:szCs w:val="26"/>
+              </w:rPr>
+              <w:t>docs/ERD.drawio</w:t>
+            </w:r>
+            <w:r>
+              <w:t xml:space="preserve">, </w:t>
+            </w:r>
+            <w:r>
+              <w:rPr>
+                <w:rStyle w:val="HTMLCode"/>
+                <w:rFonts w:ascii="Times New Roman" w:hAnsi="Times New Roman" w:cs="Times New Roman"/>
+                <w:sz w:val="26"/>
+                <w:szCs w:val="26"/>
+              </w:rPr>
+              <w:t>db/schema.sql</w:t>
+            </w:r>
+          </w:p>
+        </w:tc>
+        <w:tc>
+          <w:tcPr>
+            <w:tcW w:w="2367" w:type="dxa"/>
+            <w:tcBorders>
+              <w:top w:val="single" w:sz="4" w:space="0" w:color="999999"/>
+              <w:left w:val="single" w:sz="4" w:space="0" w:color="999999"/>
+              <w:bottom w:val="single" w:sz="4" w:space="0" w:color="999999"/>
+              <w:right w:val="single" w:sz="4" w:space="0" w:color="999999"/>
+            </w:tcBorders>
+            <w:tcMar>
+              <w:top w:w="60" w:type="dxa"/>
+              <w:left w:w="100" w:type="dxa"/>
+              <w:bottom w:w="60" w:type="dxa"/>
+              <w:right w:w="100" w:type="dxa"/>
+            </w:tcMar>
+            <w:vAlign w:val="center"/>
+          </w:tcPr>
+          <w:p>
+            <w:pPr>
+              <w:spacing w:after="20"/>
+            </w:pPr>
+            <w:r>
+              <w:t>Đối chiếu bảng với nghiệp vụ; rà soát quan hệ và ràng buộc dữ liệu</w:t>
             </w:r>
           </w:p>
         </w:tc>
@@ -15082,67 +14973,53 @@
       <w:tr>
         <w:tc>
           <w:tcPr>
-            <w:tcW w:w="1333" w:type="dxa"/>
-            <w:tcBorders>
-              <w:top w:val="single" w:sz="4" w:space="0" w:color="999999"/>
-              <w:left w:val="single" w:sz="4" w:space="0" w:color="999999"/>
-              <w:bottom w:val="single" w:sz="4" w:space="0" w:color="999999"/>
-              <w:right w:val="single" w:sz="4" w:space="0" w:color="999999"/>
-            </w:tcBorders>
-            <w:tcMar>
-              <w:top w:w="60" w:type="dxa"/>
-              <w:left w:w="100" w:type="dxa"/>
-              <w:bottom w:w="60" w:type="dxa"/>
-              <w:right w:w="100" w:type="dxa"/>
-            </w:tcMar>
-          </w:tcPr>
-          <w:p>
-            <w:pPr>
-              <w:spacing w:after="20"/>
-              <w:rPr>
-                <w:sz w:val="24"/>
-                <w:szCs w:val="24"/>
-              </w:rPr>
-            </w:pPr>
-            <w:r>
-              <w:rPr>
-                <w:sz w:val="24"/>
-                <w:szCs w:val="24"/>
-              </w:rPr>
-              <w:t>Claude</w:t>
-            </w:r>
-          </w:p>
-        </w:tc>
-        <w:tc>
-          <w:tcPr>
-            <w:tcW w:w="2542" w:type="dxa"/>
-            <w:tcBorders>
-              <w:top w:val="single" w:sz="4" w:space="0" w:color="999999"/>
-              <w:left w:val="single" w:sz="4" w:space="0" w:color="999999"/>
-              <w:bottom w:val="single" w:sz="4" w:space="0" w:color="999999"/>
-              <w:right w:val="single" w:sz="4" w:space="0" w:color="999999"/>
-            </w:tcBorders>
-            <w:tcMar>
-              <w:top w:w="60" w:type="dxa"/>
-              <w:left w:w="100" w:type="dxa"/>
-              <w:bottom w:w="60" w:type="dxa"/>
-              <w:right w:w="100" w:type="dxa"/>
-            </w:tcMar>
-          </w:tcPr>
-          <w:p>
-            <w:pPr>
-              <w:spacing w:after="20"/>
-              <w:rPr>
-                <w:sz w:val="24"/>
-                <w:szCs w:val="24"/>
-              </w:rPr>
-            </w:pPr>
-            <w:r>
-              <w:rPr>
-                <w:sz w:val="24"/>
-                <w:szCs w:val="24"/>
-              </w:rPr>
-              <w:t>Gợi ý đăng nhập, phân quyền, API token</w:t>
+            <w:tcW w:w="1428" w:type="dxa"/>
+            <w:tcBorders>
+              <w:top w:val="single" w:sz="4" w:space="0" w:color="999999"/>
+              <w:left w:val="single" w:sz="4" w:space="0" w:color="999999"/>
+              <w:bottom w:val="single" w:sz="4" w:space="0" w:color="999999"/>
+              <w:right w:val="single" w:sz="4" w:space="0" w:color="999999"/>
+            </w:tcBorders>
+            <w:tcMar>
+              <w:top w:w="60" w:type="dxa"/>
+              <w:left w:w="100" w:type="dxa"/>
+              <w:bottom w:w="60" w:type="dxa"/>
+              <w:right w:w="100" w:type="dxa"/>
+            </w:tcMar>
+            <w:vAlign w:val="center"/>
+          </w:tcPr>
+          <w:p>
+            <w:pPr>
+              <w:spacing w:after="20"/>
+            </w:pPr>
+            <w:r>
+              <w:t>Claude (Anthropic)</w:t>
+            </w:r>
+          </w:p>
+        </w:tc>
+        <w:tc>
+          <w:tcPr>
+            <w:tcW w:w="2503" w:type="dxa"/>
+            <w:tcBorders>
+              <w:top w:val="single" w:sz="4" w:space="0" w:color="999999"/>
+              <w:left w:val="single" w:sz="4" w:space="0" w:color="999999"/>
+              <w:bottom w:val="single" w:sz="4" w:space="0" w:color="999999"/>
+              <w:right w:val="single" w:sz="4" w:space="0" w:color="999999"/>
+            </w:tcBorders>
+            <w:tcMar>
+              <w:top w:w="60" w:type="dxa"/>
+              <w:left w:w="100" w:type="dxa"/>
+              <w:bottom w:w="60" w:type="dxa"/>
+              <w:right w:w="100" w:type="dxa"/>
+            </w:tcMar>
+            <w:vAlign w:val="center"/>
+          </w:tcPr>
+          <w:p>
+            <w:pPr>
+              <w:spacing w:after="20"/>
+            </w:pPr>
+            <w:r>
+              <w:t>BT1 – Đề xuất bố cục 3 màn hình tiếp nhận và quản lý yêu cầu</w:t>
             </w:r>
           </w:p>
         </w:tc>
@@ -15161,54 +15038,49 @@
               <w:bottom w:w="60" w:type="dxa"/>
               <w:right w:w="100" w:type="dxa"/>
             </w:tcMar>
-          </w:tcPr>
-          <w:p>
-            <w:pPr>
-              <w:spacing w:after="20"/>
-              <w:rPr>
-                <w:sz w:val="24"/>
-                <w:szCs w:val="24"/>
-              </w:rPr>
-            </w:pPr>
-            <w:r>
-              <w:rPr>
-                <w:sz w:val="24"/>
-                <w:szCs w:val="24"/>
-              </w:rPr>
-              <w:t>concerns/authentication.rb, authorization.rb, Api::BaseController, Api::SessionsController, User::PERMISSIONS</w:t>
-            </w:r>
-          </w:p>
-        </w:tc>
-        <w:tc>
-          <w:tcPr>
-            <w:tcW w:w="2423" w:type="dxa"/>
-            <w:tcBorders>
-              <w:top w:val="single" w:sz="4" w:space="0" w:color="999999"/>
-              <w:left w:val="single" w:sz="4" w:space="0" w:color="999999"/>
-              <w:bottom w:val="single" w:sz="4" w:space="0" w:color="999999"/>
-              <w:right w:val="single" w:sz="4" w:space="0" w:color="999999"/>
-            </w:tcBorders>
-            <w:tcMar>
-              <w:top w:w="60" w:type="dxa"/>
-              <w:left w:w="100" w:type="dxa"/>
-              <w:bottom w:w="60" w:type="dxa"/>
-              <w:right w:w="100" w:type="dxa"/>
-            </w:tcMar>
-          </w:tcPr>
-          <w:p>
-            <w:pPr>
-              <w:spacing w:after="20"/>
-              <w:rPr>
-                <w:sz w:val="24"/>
-                <w:szCs w:val="24"/>
-              </w:rPr>
-            </w:pPr>
-            <w:r>
-              <w:rPr>
-                <w:sz w:val="24"/>
-                <w:szCs w:val="24"/>
-              </w:rPr>
-              <w:t>Đăng nhập 2 vai trò trên trình duyệt; Postman 401/403; tự sửa bảng quyền theo User Story (Quản lý chỉ xem)</w:t>
+            <w:vAlign w:val="center"/>
+          </w:tcPr>
+          <w:p>
+            <w:pPr>
+              <w:spacing w:after="20"/>
+            </w:pPr>
+            <w:r>
+              <w:t xml:space="preserve">Báo cáo BT1 Mục 5; </w:t>
+            </w:r>
+            <w:r>
+              <w:rPr>
+                <w:rStyle w:val="HTMLCode"/>
+                <w:rFonts w:ascii="Times New Roman" w:hAnsi="Times New Roman" w:cs="Times New Roman"/>
+                <w:sz w:val="26"/>
+                <w:szCs w:val="26"/>
+              </w:rPr>
+              <w:t>docs/Wireframe.drawio</w:t>
+            </w:r>
+          </w:p>
+        </w:tc>
+        <w:tc>
+          <w:tcPr>
+            <w:tcW w:w="2367" w:type="dxa"/>
+            <w:tcBorders>
+              <w:top w:val="single" w:sz="4" w:space="0" w:color="999999"/>
+              <w:left w:val="single" w:sz="4" w:space="0" w:color="999999"/>
+              <w:bottom w:val="single" w:sz="4" w:space="0" w:color="999999"/>
+              <w:right w:val="single" w:sz="4" w:space="0" w:color="999999"/>
+            </w:tcBorders>
+            <w:tcMar>
+              <w:top w:w="60" w:type="dxa"/>
+              <w:left w:w="100" w:type="dxa"/>
+              <w:bottom w:w="60" w:type="dxa"/>
+              <w:right w:w="100" w:type="dxa"/>
+            </w:tcMar>
+            <w:vAlign w:val="center"/>
+          </w:tcPr>
+          <w:p>
+            <w:pPr>
+              <w:spacing w:after="20"/>
+            </w:pPr>
+            <w:r>
+              <w:t>Chỉnh trường dữ liệu, ghi chú cho khớp FR, BR, NFR; dựng lại bằng draw.io</w:t>
             </w:r>
           </w:p>
         </w:tc>
@@ -15216,67 +15088,53 @@
       <w:tr>
         <w:tc>
           <w:tcPr>
-            <w:tcW w:w="1333" w:type="dxa"/>
-            <w:tcBorders>
-              <w:top w:val="single" w:sz="4" w:space="0" w:color="999999"/>
-              <w:left w:val="single" w:sz="4" w:space="0" w:color="999999"/>
-              <w:bottom w:val="single" w:sz="4" w:space="0" w:color="999999"/>
-              <w:right w:val="single" w:sz="4" w:space="0" w:color="999999"/>
-            </w:tcBorders>
-            <w:tcMar>
-              <w:top w:w="60" w:type="dxa"/>
-              <w:left w:w="100" w:type="dxa"/>
-              <w:bottom w:w="60" w:type="dxa"/>
-              <w:right w:w="100" w:type="dxa"/>
-            </w:tcMar>
-          </w:tcPr>
-          <w:p>
-            <w:pPr>
-              <w:spacing w:after="20"/>
-              <w:rPr>
-                <w:sz w:val="24"/>
-                <w:szCs w:val="24"/>
-              </w:rPr>
-            </w:pPr>
-            <w:r>
-              <w:rPr>
-                <w:sz w:val="24"/>
-                <w:szCs w:val="24"/>
-              </w:rPr>
+            <w:tcW w:w="1428" w:type="dxa"/>
+            <w:tcBorders>
+              <w:top w:val="single" w:sz="4" w:space="0" w:color="999999"/>
+              <w:left w:val="single" w:sz="4" w:space="0" w:color="999999"/>
+              <w:bottom w:val="single" w:sz="4" w:space="0" w:color="999999"/>
+              <w:right w:val="single" w:sz="4" w:space="0" w:color="999999"/>
+            </w:tcBorders>
+            <w:tcMar>
+              <w:top w:w="60" w:type="dxa"/>
+              <w:left w:w="100" w:type="dxa"/>
+              <w:bottom w:w="60" w:type="dxa"/>
+              <w:right w:w="100" w:type="dxa"/>
+            </w:tcMar>
+            <w:vAlign w:val="center"/>
+          </w:tcPr>
+          <w:p>
+            <w:pPr>
+              <w:spacing w:after="20"/>
+            </w:pPr>
+            <w:r>
               <w:t>Claude</w:t>
             </w:r>
           </w:p>
         </w:tc>
         <w:tc>
           <w:tcPr>
-            <w:tcW w:w="2542" w:type="dxa"/>
-            <w:tcBorders>
-              <w:top w:val="single" w:sz="4" w:space="0" w:color="999999"/>
-              <w:left w:val="single" w:sz="4" w:space="0" w:color="999999"/>
-              <w:bottom w:val="single" w:sz="4" w:space="0" w:color="999999"/>
-              <w:right w:val="single" w:sz="4" w:space="0" w:color="999999"/>
-            </w:tcBorders>
-            <w:tcMar>
-              <w:top w:w="60" w:type="dxa"/>
-              <w:left w:w="100" w:type="dxa"/>
-              <w:bottom w:w="60" w:type="dxa"/>
-              <w:right w:w="100" w:type="dxa"/>
-            </w:tcMar>
-          </w:tcPr>
-          <w:p>
-            <w:pPr>
-              <w:spacing w:after="20"/>
-              <w:rPr>
-                <w:sz w:val="24"/>
-                <w:szCs w:val="24"/>
-              </w:rPr>
-            </w:pPr>
-            <w:r>
-              <w:rPr>
-                <w:sz w:val="24"/>
-                <w:szCs w:val="24"/>
-              </w:rPr>
-              <w:t>Gợi ý lớp client API và 3 trạng thái giao diện</w:t>
+            <w:tcW w:w="2503" w:type="dxa"/>
+            <w:tcBorders>
+              <w:top w:val="single" w:sz="4" w:space="0" w:color="999999"/>
+              <w:left w:val="single" w:sz="4" w:space="0" w:color="999999"/>
+              <w:bottom w:val="single" w:sz="4" w:space="0" w:color="999999"/>
+              <w:right w:val="single" w:sz="4" w:space="0" w:color="999999"/>
+            </w:tcBorders>
+            <w:tcMar>
+              <w:top w:w="60" w:type="dxa"/>
+              <w:left w:w="100" w:type="dxa"/>
+              <w:bottom w:w="60" w:type="dxa"/>
+              <w:right w:w="100" w:type="dxa"/>
+            </w:tcMar>
+            <w:vAlign w:val="center"/>
+          </w:tcPr>
+          <w:p>
+            <w:pPr>
+              <w:spacing w:after="20"/>
+            </w:pPr>
+            <w:r>
+              <w:t>BT1 bản chỉnh sửa – Rà soát theo nhận xét: bổ sung FR09, User Story, đặc tả use case, chú thích ký hiệu, cột ERD, SQL DDL, viết lại lập luận Mục 3.2</w:t>
             </w:r>
           </w:p>
         </w:tc>
@@ -15295,54 +15153,40 @@
               <w:bottom w:w="60" w:type="dxa"/>
               <w:right w:w="100" w:type="dxa"/>
             </w:tcMar>
-          </w:tcPr>
-          <w:p>
-            <w:pPr>
-              <w:spacing w:after="20"/>
-              <w:rPr>
-                <w:sz w:val="24"/>
-                <w:szCs w:val="24"/>
-              </w:rPr>
-            </w:pPr>
-            <w:r>
-              <w:rPr>
-                <w:sz w:val="24"/>
-                <w:szCs w:val="24"/>
-              </w:rPr>
-              <w:t>app/javascript/api/client.js, api/ui.js, *_controller.js của 3 màn hình</w:t>
-            </w:r>
-          </w:p>
-        </w:tc>
-        <w:tc>
-          <w:tcPr>
-            <w:tcW w:w="2423" w:type="dxa"/>
-            <w:tcBorders>
-              <w:top w:val="single" w:sz="4" w:space="0" w:color="999999"/>
-              <w:left w:val="single" w:sz="4" w:space="0" w:color="999999"/>
-              <w:bottom w:val="single" w:sz="4" w:space="0" w:color="999999"/>
-              <w:right w:val="single" w:sz="4" w:space="0" w:color="999999"/>
-            </w:tcBorders>
-            <w:tcMar>
-              <w:top w:w="60" w:type="dxa"/>
-              <w:left w:w="100" w:type="dxa"/>
-              <w:bottom w:w="60" w:type="dxa"/>
-              <w:right w:w="100" w:type="dxa"/>
-            </w:tcMar>
-          </w:tcPr>
-          <w:p>
-            <w:pPr>
-              <w:spacing w:after="20"/>
-              <w:rPr>
-                <w:sz w:val="24"/>
-                <w:szCs w:val="24"/>
-              </w:rPr>
-            </w:pPr>
-            <w:r>
-              <w:rPr>
-                <w:sz w:val="24"/>
-                <w:szCs w:val="24"/>
-              </w:rPr>
-              <w:t>DevTools Network: Slow 4G, Offline, bấm Thử lại; kiểm tra request /api/…</w:t>
+            <w:vAlign w:val="center"/>
+          </w:tcPr>
+          <w:p>
+            <w:pPr>
+              <w:spacing w:after="20"/>
+            </w:pPr>
+            <w:r>
+              <w:t>Toàn bộ báo cáo BT1 v2</w:t>
+            </w:r>
+          </w:p>
+        </w:tc>
+        <w:tc>
+          <w:tcPr>
+            <w:tcW w:w="2367" w:type="dxa"/>
+            <w:tcBorders>
+              <w:top w:val="single" w:sz="4" w:space="0" w:color="999999"/>
+              <w:left w:val="single" w:sz="4" w:space="0" w:color="999999"/>
+              <w:bottom w:val="single" w:sz="4" w:space="0" w:color="999999"/>
+              <w:right w:val="single" w:sz="4" w:space="0" w:color="999999"/>
+            </w:tcBorders>
+            <w:tcMar>
+              <w:top w:w="60" w:type="dxa"/>
+              <w:left w:w="100" w:type="dxa"/>
+              <w:bottom w:w="60" w:type="dxa"/>
+              <w:right w:w="100" w:type="dxa"/>
+            </w:tcMar>
+            <w:vAlign w:val="center"/>
+          </w:tcPr>
+          <w:p>
+            <w:pPr>
+              <w:spacing w:after="20"/>
+            </w:pPr>
+            <w:r>
+              <w:t>Kiểm tra lại từng thay đổi với SRS và wireframe; chạy SQL DDL trên PostgreSQL</w:t>
             </w:r>
           </w:p>
         </w:tc>
@@ -15350,66 +15194,675 @@
       <w:tr>
         <w:tc>
           <w:tcPr>
-            <w:tcW w:w="1333" w:type="dxa"/>
-            <w:tcBorders>
-              <w:top w:val="single" w:sz="4" w:space="0" w:color="999999"/>
-              <w:left w:val="single" w:sz="4" w:space="0" w:color="999999"/>
-              <w:bottom w:val="single" w:sz="4" w:space="0" w:color="999999"/>
-              <w:right w:val="single" w:sz="4" w:space="0" w:color="999999"/>
-            </w:tcBorders>
-            <w:tcMar>
-              <w:top w:w="60" w:type="dxa"/>
-              <w:left w:w="100" w:type="dxa"/>
-              <w:bottom w:w="60" w:type="dxa"/>
-              <w:right w:w="100" w:type="dxa"/>
-            </w:tcMar>
-          </w:tcPr>
-          <w:p>
-            <w:pPr>
-              <w:spacing w:after="20"/>
-              <w:rPr>
-                <w:sz w:val="24"/>
-                <w:szCs w:val="24"/>
-              </w:rPr>
-            </w:pPr>
-            <w:r>
-              <w:rPr>
-                <w:sz w:val="24"/>
-                <w:szCs w:val="24"/>
-              </w:rPr>
+            <w:tcW w:w="1428" w:type="dxa"/>
+            <w:tcBorders>
+              <w:top w:val="single" w:sz="4" w:space="0" w:color="999999"/>
+              <w:left w:val="single" w:sz="4" w:space="0" w:color="999999"/>
+              <w:bottom w:val="single" w:sz="4" w:space="0" w:color="999999"/>
+              <w:right w:val="single" w:sz="4" w:space="0" w:color="999999"/>
+            </w:tcBorders>
+            <w:tcMar>
+              <w:top w:w="60" w:type="dxa"/>
+              <w:left w:w="100" w:type="dxa"/>
+              <w:bottom w:w="60" w:type="dxa"/>
+              <w:right w:w="100" w:type="dxa"/>
+            </w:tcMar>
+          </w:tcPr>
+          <w:p>
+            <w:pPr>
+              <w:spacing w:after="20"/>
+            </w:pPr>
+            <w:r>
+              <w:t>Claude (Anthropic)</w:t>
+            </w:r>
+          </w:p>
+        </w:tc>
+        <w:tc>
+          <w:tcPr>
+            <w:tcW w:w="2503" w:type="dxa"/>
+            <w:tcBorders>
+              <w:top w:val="single" w:sz="4" w:space="0" w:color="999999"/>
+              <w:left w:val="single" w:sz="4" w:space="0" w:color="999999"/>
+              <w:bottom w:val="single" w:sz="4" w:space="0" w:color="999999"/>
+              <w:right w:val="single" w:sz="4" w:space="0" w:color="999999"/>
+            </w:tcBorders>
+            <w:tcMar>
+              <w:top w:w="60" w:type="dxa"/>
+              <w:left w:w="100" w:type="dxa"/>
+              <w:bottom w:w="60" w:type="dxa"/>
+              <w:right w:w="100" w:type="dxa"/>
+            </w:tcMar>
+          </w:tcPr>
+          <w:p>
+            <w:pPr>
+              <w:spacing w:after="20"/>
+            </w:pPr>
+            <w:r>
+              <w:t>Hướng dẫn cài Ruby, PostgreSQL, tạo project Rails 8.1; đọc lỗi khi cài</w:t>
+            </w:r>
+          </w:p>
+        </w:tc>
+        <w:tc>
+          <w:tcPr>
+            <w:tcW w:w="3340" w:type="dxa"/>
+            <w:tcBorders>
+              <w:top w:val="single" w:sz="4" w:space="0" w:color="999999"/>
+              <w:left w:val="single" w:sz="4" w:space="0" w:color="999999"/>
+              <w:bottom w:val="single" w:sz="4" w:space="0" w:color="999999"/>
+              <w:right w:val="single" w:sz="4" w:space="0" w:color="999999"/>
+            </w:tcBorders>
+            <w:tcMar>
+              <w:top w:w="60" w:type="dxa"/>
+              <w:left w:w="100" w:type="dxa"/>
+              <w:bottom w:w="60" w:type="dxa"/>
+              <w:right w:w="100" w:type="dxa"/>
+            </w:tcMar>
+          </w:tcPr>
+          <w:p>
+            <w:pPr>
+              <w:spacing w:after="20"/>
+            </w:pPr>
+            <w:r>
+              <w:t>Môi trường; src/Gemfile, src/config/database.yml</w:t>
+            </w:r>
+          </w:p>
+        </w:tc>
+        <w:tc>
+          <w:tcPr>
+            <w:tcW w:w="2367" w:type="dxa"/>
+            <w:tcBorders>
+              <w:top w:val="single" w:sz="4" w:space="0" w:color="999999"/>
+              <w:left w:val="single" w:sz="4" w:space="0" w:color="999999"/>
+              <w:bottom w:val="single" w:sz="4" w:space="0" w:color="999999"/>
+              <w:right w:val="single" w:sz="4" w:space="0" w:color="999999"/>
+            </w:tcBorders>
+            <w:tcMar>
+              <w:top w:w="60" w:type="dxa"/>
+              <w:left w:w="100" w:type="dxa"/>
+              <w:bottom w:w="60" w:type="dxa"/>
+              <w:right w:w="100" w:type="dxa"/>
+            </w:tcMar>
+          </w:tcPr>
+          <w:p>
+            <w:pPr>
+              <w:spacing w:after="20"/>
+            </w:pPr>
+            <w:r>
+              <w:t>Tự chạy từng lệnh trên WSL, sửa đến khi bin/rails server chạy</w:t>
+            </w:r>
+          </w:p>
+        </w:tc>
+      </w:tr>
+      <w:tr>
+        <w:tc>
+          <w:tcPr>
+            <w:tcW w:w="1428" w:type="dxa"/>
+            <w:tcBorders>
+              <w:top w:val="single" w:sz="4" w:space="0" w:color="999999"/>
+              <w:left w:val="single" w:sz="4" w:space="0" w:color="999999"/>
+              <w:bottom w:val="single" w:sz="4" w:space="0" w:color="999999"/>
+              <w:right w:val="single" w:sz="4" w:space="0" w:color="999999"/>
+            </w:tcBorders>
+            <w:tcMar>
+              <w:top w:w="60" w:type="dxa"/>
+              <w:left w:w="100" w:type="dxa"/>
+              <w:bottom w:w="60" w:type="dxa"/>
+              <w:right w:w="100" w:type="dxa"/>
+            </w:tcMar>
+          </w:tcPr>
+          <w:p>
+            <w:pPr>
+              <w:spacing w:after="20"/>
+            </w:pPr>
+            <w:r>
               <w:t>Claude</w:t>
             </w:r>
           </w:p>
         </w:tc>
         <w:tc>
           <w:tcPr>
-            <w:tcW w:w="2542" w:type="dxa"/>
-            <w:tcBorders>
-              <w:top w:val="single" w:sz="4" w:space="0" w:color="999999"/>
-              <w:left w:val="single" w:sz="4" w:space="0" w:color="999999"/>
-              <w:bottom w:val="single" w:sz="4" w:space="0" w:color="999999"/>
-              <w:right w:val="single" w:sz="4" w:space="0" w:color="999999"/>
-            </w:tcBorders>
-            <w:tcMar>
-              <w:top w:w="60" w:type="dxa"/>
-              <w:left w:w="100" w:type="dxa"/>
-              <w:bottom w:w="60" w:type="dxa"/>
-              <w:right w:w="100" w:type="dxa"/>
-            </w:tcMar>
-          </w:tcPr>
-          <w:p>
-            <w:pPr>
-              <w:spacing w:after="20"/>
-              <w:rPr>
-                <w:sz w:val="24"/>
-                <w:szCs w:val="24"/>
-              </w:rPr>
-            </w:pPr>
-            <w:r>
-              <w:rPr>
-                <w:sz w:val="24"/>
-                <w:szCs w:val="24"/>
-              </w:rPr>
+            <w:tcW w:w="2503" w:type="dxa"/>
+            <w:tcBorders>
+              <w:top w:val="single" w:sz="4" w:space="0" w:color="999999"/>
+              <w:left w:val="single" w:sz="4" w:space="0" w:color="999999"/>
+              <w:bottom w:val="single" w:sz="4" w:space="0" w:color="999999"/>
+              <w:right w:val="single" w:sz="4" w:space="0" w:color="999999"/>
+            </w:tcBorders>
+            <w:tcMar>
+              <w:top w:w="60" w:type="dxa"/>
+              <w:left w:w="100" w:type="dxa"/>
+              <w:bottom w:w="60" w:type="dxa"/>
+              <w:right w:w="100" w:type="dxa"/>
+            </w:tcMar>
+          </w:tcPr>
+          <w:p>
+            <w:pPr>
+              <w:spacing w:after="20"/>
+            </w:pPr>
+            <w:r>
+              <w:t>Gợi ý migration, ràng buộc CHECK/UNIQUE/FK, seed</w:t>
+            </w:r>
+          </w:p>
+        </w:tc>
+        <w:tc>
+          <w:tcPr>
+            <w:tcW w:w="3340" w:type="dxa"/>
+            <w:tcBorders>
+              <w:top w:val="single" w:sz="4" w:space="0" w:color="999999"/>
+              <w:left w:val="single" w:sz="4" w:space="0" w:color="999999"/>
+              <w:bottom w:val="single" w:sz="4" w:space="0" w:color="999999"/>
+              <w:right w:val="single" w:sz="4" w:space="0" w:color="999999"/>
+            </w:tcBorders>
+            <w:tcMar>
+              <w:top w:w="60" w:type="dxa"/>
+              <w:left w:w="100" w:type="dxa"/>
+              <w:bottom w:w="60" w:type="dxa"/>
+              <w:right w:w="100" w:type="dxa"/>
+            </w:tcMar>
+          </w:tcPr>
+          <w:p>
+            <w:pPr>
+              <w:spacing w:after="20"/>
+            </w:pPr>
+            <w:r>
+              <w:t>src/db/migrate/*, src/db/seeds.rb, db/schema.sql</w:t>
+            </w:r>
+          </w:p>
+        </w:tc>
+        <w:tc>
+          <w:tcPr>
+            <w:tcW w:w="2367" w:type="dxa"/>
+            <w:tcBorders>
+              <w:top w:val="single" w:sz="4" w:space="0" w:color="999999"/>
+              <w:left w:val="single" w:sz="4" w:space="0" w:color="999999"/>
+              <w:bottom w:val="single" w:sz="4" w:space="0" w:color="999999"/>
+              <w:right w:val="single" w:sz="4" w:space="0" w:color="999999"/>
+            </w:tcBorders>
+            <w:tcMar>
+              <w:top w:w="60" w:type="dxa"/>
+              <w:left w:w="100" w:type="dxa"/>
+              <w:bottom w:w="60" w:type="dxa"/>
+              <w:right w:w="100" w:type="dxa"/>
+            </w:tcMar>
+          </w:tcPr>
+          <w:p>
+            <w:pPr>
+              <w:spacing w:after="20"/>
+            </w:pPr>
+            <w:r>
+              <w:t>db:prepare trên CSDL trống; seed 2 lần so sánh số bản ghi; nạp schema.sql bằng psql</w:t>
+            </w:r>
+          </w:p>
+        </w:tc>
+      </w:tr>
+      <w:tr>
+        <w:tc>
+          <w:tcPr>
+            <w:tcW w:w="1428" w:type="dxa"/>
+            <w:tcBorders>
+              <w:top w:val="single" w:sz="4" w:space="0" w:color="999999"/>
+              <w:left w:val="single" w:sz="4" w:space="0" w:color="999999"/>
+              <w:bottom w:val="single" w:sz="4" w:space="0" w:color="999999"/>
+              <w:right w:val="single" w:sz="4" w:space="0" w:color="999999"/>
+            </w:tcBorders>
+            <w:tcMar>
+              <w:top w:w="60" w:type="dxa"/>
+              <w:left w:w="100" w:type="dxa"/>
+              <w:bottom w:w="60" w:type="dxa"/>
+              <w:right w:w="100" w:type="dxa"/>
+            </w:tcMar>
+          </w:tcPr>
+          <w:p>
+            <w:pPr>
+              <w:spacing w:after="20"/>
+            </w:pPr>
+            <w:r>
+              <w:lastRenderedPageBreak/>
+              <w:t>Claude</w:t>
+            </w:r>
+          </w:p>
+        </w:tc>
+        <w:tc>
+          <w:tcPr>
+            <w:tcW w:w="2503" w:type="dxa"/>
+            <w:tcBorders>
+              <w:top w:val="single" w:sz="4" w:space="0" w:color="999999"/>
+              <w:left w:val="single" w:sz="4" w:space="0" w:color="999999"/>
+              <w:bottom w:val="single" w:sz="4" w:space="0" w:color="999999"/>
+              <w:right w:val="single" w:sz="4" w:space="0" w:color="999999"/>
+            </w:tcBorders>
+            <w:tcMar>
+              <w:top w:w="60" w:type="dxa"/>
+              <w:left w:w="100" w:type="dxa"/>
+              <w:bottom w:w="60" w:type="dxa"/>
+              <w:right w:w="100" w:type="dxa"/>
+            </w:tcMar>
+          </w:tcPr>
+          <w:p>
+            <w:pPr>
+              <w:spacing w:after="20"/>
+            </w:pPr>
+            <w:r>
+              <w:t>Gợi ý service nghiệp vụ</w:t>
+            </w:r>
+          </w:p>
+        </w:tc>
+        <w:tc>
+          <w:tcPr>
+            <w:tcW w:w="3340" w:type="dxa"/>
+            <w:tcBorders>
+              <w:top w:val="single" w:sz="4" w:space="0" w:color="999999"/>
+              <w:left w:val="single" w:sz="4" w:space="0" w:color="999999"/>
+              <w:bottom w:val="single" w:sz="4" w:space="0" w:color="999999"/>
+              <w:right w:val="single" w:sz="4" w:space="0" w:color="999999"/>
+            </w:tcBorders>
+            <w:tcMar>
+              <w:top w:w="60" w:type="dxa"/>
+              <w:left w:w="100" w:type="dxa"/>
+              <w:bottom w:w="60" w:type="dxa"/>
+              <w:right w:w="100" w:type="dxa"/>
+            </w:tcMar>
+          </w:tcPr>
+          <w:p>
+            <w:pPr>
+              <w:spacing w:after="20"/>
+            </w:pPr>
+            <w:r>
+              <w:t>WarrantyRequestCreator, RequestCodeGenerator, SlaDeadlineCalculator, WarrantyRequestStatusChanger, CustomerService, IssueCategoryService</w:t>
+            </w:r>
+          </w:p>
+        </w:tc>
+        <w:tc>
+          <w:tcPr>
+            <w:tcW w:w="2367" w:type="dxa"/>
+            <w:tcBorders>
+              <w:top w:val="single" w:sz="4" w:space="0" w:color="999999"/>
+              <w:left w:val="single" w:sz="4" w:space="0" w:color="999999"/>
+              <w:bottom w:val="single" w:sz="4" w:space="0" w:color="999999"/>
+              <w:right w:val="single" w:sz="4" w:space="0" w:color="999999"/>
+            </w:tcBorders>
+            <w:tcMar>
+              <w:top w:w="60" w:type="dxa"/>
+              <w:left w:w="100" w:type="dxa"/>
+              <w:bottom w:w="60" w:type="dxa"/>
+              <w:right w:w="100" w:type="dxa"/>
+            </w:tcMar>
+          </w:tcPr>
+          <w:p>
+            <w:pPr>
+              <w:spacing w:after="20"/>
+              <w:rPr>
+                <w:lang w:val="vi-VN"/>
+              </w:rPr>
+            </w:pPr>
+            <w:r>
+              <w:t>Chạy test service; thử bằng Postman các trường hợp 201/400/409/</w:t>
+            </w:r>
+            <w:r>
+              <w:t>422</w:t>
+            </w:r>
+            <w:r>
+              <w:rPr>
+                <w:lang w:val="vi-VN"/>
+              </w:rPr>
+              <w:t>/503</w:t>
+            </w:r>
+          </w:p>
+        </w:tc>
+      </w:tr>
+      <w:tr>
+        <w:tc>
+          <w:tcPr>
+            <w:tcW w:w="1428" w:type="dxa"/>
+            <w:tcBorders>
+              <w:top w:val="single" w:sz="4" w:space="0" w:color="999999"/>
+              <w:left w:val="single" w:sz="4" w:space="0" w:color="999999"/>
+              <w:bottom w:val="single" w:sz="4" w:space="0" w:color="999999"/>
+              <w:right w:val="single" w:sz="4" w:space="0" w:color="999999"/>
+            </w:tcBorders>
+            <w:tcMar>
+              <w:top w:w="60" w:type="dxa"/>
+              <w:left w:w="100" w:type="dxa"/>
+              <w:bottom w:w="60" w:type="dxa"/>
+              <w:right w:w="100" w:type="dxa"/>
+            </w:tcMar>
+          </w:tcPr>
+          <w:p>
+            <w:pPr>
+              <w:spacing w:after="20"/>
+            </w:pPr>
+            <w:r>
+              <w:t>Claude</w:t>
+            </w:r>
+          </w:p>
+        </w:tc>
+        <w:tc>
+          <w:tcPr>
+            <w:tcW w:w="2503" w:type="dxa"/>
+            <w:tcBorders>
+              <w:top w:val="single" w:sz="4" w:space="0" w:color="999999"/>
+              <w:left w:val="single" w:sz="4" w:space="0" w:color="999999"/>
+              <w:bottom w:val="single" w:sz="4" w:space="0" w:color="999999"/>
+              <w:right w:val="single" w:sz="4" w:space="0" w:color="999999"/>
+            </w:tcBorders>
+            <w:tcMar>
+              <w:top w:w="60" w:type="dxa"/>
+              <w:left w:w="100" w:type="dxa"/>
+              <w:bottom w:w="60" w:type="dxa"/>
+              <w:right w:w="100" w:type="dxa"/>
+            </w:tcMar>
+          </w:tcPr>
+          <w:p>
+            <w:pPr>
+              <w:spacing w:after="20"/>
+            </w:pPr>
+            <w:r>
+              <w:t>Gợi ý làm sạch dữ liệu CSV của giảng viên</w:t>
+            </w:r>
+          </w:p>
+        </w:tc>
+        <w:tc>
+          <w:tcPr>
+            <w:tcW w:w="3340" w:type="dxa"/>
+            <w:tcBorders>
+              <w:top w:val="single" w:sz="4" w:space="0" w:color="999999"/>
+              <w:left w:val="single" w:sz="4" w:space="0" w:color="999999"/>
+              <w:bottom w:val="single" w:sz="4" w:space="0" w:color="999999"/>
+              <w:right w:val="single" w:sz="4" w:space="0" w:color="999999"/>
+            </w:tcBorders>
+            <w:tcMar>
+              <w:top w:w="60" w:type="dxa"/>
+              <w:left w:w="100" w:type="dxa"/>
+              <w:bottom w:w="60" w:type="dxa"/>
+              <w:right w:w="100" w:type="dxa"/>
+            </w:tcMar>
+          </w:tcPr>
+          <w:p>
+            <w:pPr>
+              <w:spacing w:after="20"/>
+            </w:pPr>
+            <w:r>
+              <w:t>CustomerRowNormalizer, CustomerCsvImporter, lib/tasks/import.rake</w:t>
+            </w:r>
+          </w:p>
+        </w:tc>
+        <w:tc>
+          <w:tcPr>
+            <w:tcW w:w="2367" w:type="dxa"/>
+            <w:tcBorders>
+              <w:top w:val="single" w:sz="4" w:space="0" w:color="999999"/>
+              <w:left w:val="single" w:sz="4" w:space="0" w:color="999999"/>
+              <w:bottom w:val="single" w:sz="4" w:space="0" w:color="999999"/>
+              <w:right w:val="single" w:sz="4" w:space="0" w:color="999999"/>
+            </w:tcBorders>
+            <w:tcMar>
+              <w:top w:w="60" w:type="dxa"/>
+              <w:left w:w="100" w:type="dxa"/>
+              <w:bottom w:w="60" w:type="dxa"/>
+              <w:right w:w="100" w:type="dxa"/>
+            </w:tcMar>
+          </w:tcPr>
+          <w:p>
+            <w:pPr>
+              <w:spacing w:after="20"/>
+            </w:pPr>
+            <w:r>
+              <w:t>Chạy import 2 lần (lần 2 nạp 0); xem tệp customers_reject.csv</w:t>
+            </w:r>
+          </w:p>
+        </w:tc>
+      </w:tr>
+      <w:tr>
+        <w:tc>
+          <w:tcPr>
+            <w:tcW w:w="1428" w:type="dxa"/>
+            <w:tcBorders>
+              <w:top w:val="single" w:sz="4" w:space="0" w:color="999999"/>
+              <w:left w:val="single" w:sz="4" w:space="0" w:color="999999"/>
+              <w:bottom w:val="single" w:sz="4" w:space="0" w:color="999999"/>
+              <w:right w:val="single" w:sz="4" w:space="0" w:color="999999"/>
+            </w:tcBorders>
+            <w:tcMar>
+              <w:top w:w="60" w:type="dxa"/>
+              <w:left w:w="100" w:type="dxa"/>
+              <w:bottom w:w="60" w:type="dxa"/>
+              <w:right w:w="100" w:type="dxa"/>
+            </w:tcMar>
+          </w:tcPr>
+          <w:p>
+            <w:pPr>
+              <w:spacing w:after="20"/>
+            </w:pPr>
+            <w:r>
+              <w:t>Claude</w:t>
+            </w:r>
+          </w:p>
+        </w:tc>
+        <w:tc>
+          <w:tcPr>
+            <w:tcW w:w="2503" w:type="dxa"/>
+            <w:tcBorders>
+              <w:top w:val="single" w:sz="4" w:space="0" w:color="999999"/>
+              <w:left w:val="single" w:sz="4" w:space="0" w:color="999999"/>
+              <w:bottom w:val="single" w:sz="4" w:space="0" w:color="999999"/>
+              <w:right w:val="single" w:sz="4" w:space="0" w:color="999999"/>
+            </w:tcBorders>
+            <w:tcMar>
+              <w:top w:w="60" w:type="dxa"/>
+              <w:left w:w="100" w:type="dxa"/>
+              <w:bottom w:w="60" w:type="dxa"/>
+              <w:right w:w="100" w:type="dxa"/>
+            </w:tcMar>
+          </w:tcPr>
+          <w:p>
+            <w:pPr>
+              <w:spacing w:after="20"/>
+            </w:pPr>
+            <w:r>
+              <w:t>Gợi ý đăng nhập, phân quyền, API token</w:t>
+            </w:r>
+          </w:p>
+        </w:tc>
+        <w:tc>
+          <w:tcPr>
+            <w:tcW w:w="3340" w:type="dxa"/>
+            <w:tcBorders>
+              <w:top w:val="single" w:sz="4" w:space="0" w:color="999999"/>
+              <w:left w:val="single" w:sz="4" w:space="0" w:color="999999"/>
+              <w:bottom w:val="single" w:sz="4" w:space="0" w:color="999999"/>
+              <w:right w:val="single" w:sz="4" w:space="0" w:color="999999"/>
+            </w:tcBorders>
+            <w:tcMar>
+              <w:top w:w="60" w:type="dxa"/>
+              <w:left w:w="100" w:type="dxa"/>
+              <w:bottom w:w="60" w:type="dxa"/>
+              <w:right w:w="100" w:type="dxa"/>
+            </w:tcMar>
+          </w:tcPr>
+          <w:p>
+            <w:pPr>
+              <w:spacing w:after="20"/>
+            </w:pPr>
+            <w:r>
+              <w:t>concerns/authentication.rb, authorization.rb, Api::BaseController, Api::SessionsController, User::PERMISSIONS</w:t>
+            </w:r>
+          </w:p>
+        </w:tc>
+        <w:tc>
+          <w:tcPr>
+            <w:tcW w:w="2367" w:type="dxa"/>
+            <w:tcBorders>
+              <w:top w:val="single" w:sz="4" w:space="0" w:color="999999"/>
+              <w:left w:val="single" w:sz="4" w:space="0" w:color="999999"/>
+              <w:bottom w:val="single" w:sz="4" w:space="0" w:color="999999"/>
+              <w:right w:val="single" w:sz="4" w:space="0" w:color="999999"/>
+            </w:tcBorders>
+            <w:tcMar>
+              <w:top w:w="60" w:type="dxa"/>
+              <w:left w:w="100" w:type="dxa"/>
+              <w:bottom w:w="60" w:type="dxa"/>
+              <w:right w:w="100" w:type="dxa"/>
+            </w:tcMar>
+          </w:tcPr>
+          <w:p>
+            <w:pPr>
+              <w:spacing w:after="20"/>
+            </w:pPr>
+            <w:r>
+              <w:t>Đăng nhập 2 vai trò trên trình duyệt; Postman 401/403; tự sửa bảng quyền theo User Story (Quản lý chỉ xem)</w:t>
+            </w:r>
+          </w:p>
+        </w:tc>
+      </w:tr>
+      <w:tr>
+        <w:tc>
+          <w:tcPr>
+            <w:tcW w:w="1428" w:type="dxa"/>
+            <w:tcBorders>
+              <w:top w:val="single" w:sz="4" w:space="0" w:color="999999"/>
+              <w:left w:val="single" w:sz="4" w:space="0" w:color="999999"/>
+              <w:bottom w:val="single" w:sz="4" w:space="0" w:color="999999"/>
+              <w:right w:val="single" w:sz="4" w:space="0" w:color="999999"/>
+            </w:tcBorders>
+            <w:tcMar>
+              <w:top w:w="60" w:type="dxa"/>
+              <w:left w:w="100" w:type="dxa"/>
+              <w:bottom w:w="60" w:type="dxa"/>
+              <w:right w:w="100" w:type="dxa"/>
+            </w:tcMar>
+          </w:tcPr>
+          <w:p>
+            <w:pPr>
+              <w:spacing w:after="20"/>
+            </w:pPr>
+            <w:r>
+              <w:t>Claude</w:t>
+            </w:r>
+          </w:p>
+        </w:tc>
+        <w:tc>
+          <w:tcPr>
+            <w:tcW w:w="2503" w:type="dxa"/>
+            <w:tcBorders>
+              <w:top w:val="single" w:sz="4" w:space="0" w:color="999999"/>
+              <w:left w:val="single" w:sz="4" w:space="0" w:color="999999"/>
+              <w:bottom w:val="single" w:sz="4" w:space="0" w:color="999999"/>
+              <w:right w:val="single" w:sz="4" w:space="0" w:color="999999"/>
+            </w:tcBorders>
+            <w:tcMar>
+              <w:top w:w="60" w:type="dxa"/>
+              <w:left w:w="100" w:type="dxa"/>
+              <w:bottom w:w="60" w:type="dxa"/>
+              <w:right w:w="100" w:type="dxa"/>
+            </w:tcMar>
+          </w:tcPr>
+          <w:p>
+            <w:pPr>
+              <w:spacing w:after="20"/>
+            </w:pPr>
+            <w:r>
+              <w:t>Gợi ý lớp client API và 3 trạng thái giao diện</w:t>
+            </w:r>
+          </w:p>
+        </w:tc>
+        <w:tc>
+          <w:tcPr>
+            <w:tcW w:w="3340" w:type="dxa"/>
+            <w:tcBorders>
+              <w:top w:val="single" w:sz="4" w:space="0" w:color="999999"/>
+              <w:left w:val="single" w:sz="4" w:space="0" w:color="999999"/>
+              <w:bottom w:val="single" w:sz="4" w:space="0" w:color="999999"/>
+              <w:right w:val="single" w:sz="4" w:space="0" w:color="999999"/>
+            </w:tcBorders>
+            <w:tcMar>
+              <w:top w:w="60" w:type="dxa"/>
+              <w:left w:w="100" w:type="dxa"/>
+              <w:bottom w:w="60" w:type="dxa"/>
+              <w:right w:w="100" w:type="dxa"/>
+            </w:tcMar>
+          </w:tcPr>
+          <w:p>
+            <w:pPr>
+              <w:spacing w:after="20"/>
+            </w:pPr>
+            <w:r>
+              <w:t>app/javascript/api/client.js, api/ui.js, *_controller.js của 3 màn hình</w:t>
+            </w:r>
+          </w:p>
+        </w:tc>
+        <w:tc>
+          <w:tcPr>
+            <w:tcW w:w="2367" w:type="dxa"/>
+            <w:tcBorders>
+              <w:top w:val="single" w:sz="4" w:space="0" w:color="999999"/>
+              <w:left w:val="single" w:sz="4" w:space="0" w:color="999999"/>
+              <w:bottom w:val="single" w:sz="4" w:space="0" w:color="999999"/>
+              <w:right w:val="single" w:sz="4" w:space="0" w:color="999999"/>
+            </w:tcBorders>
+            <w:tcMar>
+              <w:top w:w="60" w:type="dxa"/>
+              <w:left w:w="100" w:type="dxa"/>
+              <w:bottom w:w="60" w:type="dxa"/>
+              <w:right w:w="100" w:type="dxa"/>
+            </w:tcMar>
+          </w:tcPr>
+          <w:p>
+            <w:pPr>
+              <w:spacing w:after="20"/>
+            </w:pPr>
+            <w:r>
+              <w:t>DevTools Network: Slow 4G, Offline, bấm Thử lại; kiểm tra request /api/…</w:t>
+            </w:r>
+          </w:p>
+        </w:tc>
+      </w:tr>
+      <w:tr>
+        <w:tc>
+          <w:tcPr>
+            <w:tcW w:w="1428" w:type="dxa"/>
+            <w:tcBorders>
+              <w:top w:val="single" w:sz="4" w:space="0" w:color="999999"/>
+              <w:left w:val="single" w:sz="4" w:space="0" w:color="999999"/>
+              <w:bottom w:val="single" w:sz="4" w:space="0" w:color="999999"/>
+              <w:right w:val="single" w:sz="4" w:space="0" w:color="999999"/>
+            </w:tcBorders>
+            <w:tcMar>
+              <w:top w:w="60" w:type="dxa"/>
+              <w:left w:w="100" w:type="dxa"/>
+              <w:bottom w:w="60" w:type="dxa"/>
+              <w:right w:w="100" w:type="dxa"/>
+            </w:tcMar>
+          </w:tcPr>
+          <w:p>
+            <w:pPr>
+              <w:spacing w:after="20"/>
+            </w:pPr>
+            <w:r>
+              <w:t>Claude</w:t>
+            </w:r>
+          </w:p>
+        </w:tc>
+        <w:tc>
+          <w:tcPr>
+            <w:tcW w:w="2503" w:type="dxa"/>
+            <w:tcBorders>
+              <w:top w:val="single" w:sz="4" w:space="0" w:color="999999"/>
+              <w:left w:val="single" w:sz="4" w:space="0" w:color="999999"/>
+              <w:bottom w:val="single" w:sz="4" w:space="0" w:color="999999"/>
+              <w:right w:val="single" w:sz="4" w:space="0" w:color="999999"/>
+            </w:tcBorders>
+            <w:tcMar>
+              <w:top w:w="60" w:type="dxa"/>
+              <w:left w:w="100" w:type="dxa"/>
+              <w:bottom w:w="60" w:type="dxa"/>
+              <w:right w:w="100" w:type="dxa"/>
+            </w:tcMar>
+          </w:tcPr>
+          <w:p>
+            <w:pPr>
+              <w:spacing w:after="20"/>
+            </w:pPr>
+            <w:r>
               <w:t>Gợi ý test, README, tài liệu, sơ đồ draw.io, chia commit</w:t>
             </w:r>
           </w:p>
@@ -15433,49 +15886,33 @@
           <w:p>
             <w:pPr>
               <w:spacing w:after="20"/>
-              <w:rPr>
-                <w:sz w:val="24"/>
-                <w:szCs w:val="24"/>
-              </w:rPr>
-            </w:pPr>
-            <w:r>
-              <w:rPr>
-                <w:sz w:val="24"/>
-                <w:szCs w:val="24"/>
-              </w:rPr>
+            </w:pPr>
+            <w:r>
               <w:t>src/test/**, README.md, docs/*</w:t>
             </w:r>
           </w:p>
         </w:tc>
         <w:tc>
           <w:tcPr>
-            <w:tcW w:w="2423" w:type="dxa"/>
-            <w:tcBorders>
-              <w:top w:val="single" w:sz="4" w:space="0" w:color="999999"/>
-              <w:left w:val="single" w:sz="4" w:space="0" w:color="999999"/>
-              <w:bottom w:val="single" w:sz="4" w:space="0" w:color="999999"/>
-              <w:right w:val="single" w:sz="4" w:space="0" w:color="999999"/>
-            </w:tcBorders>
-            <w:tcMar>
-              <w:top w:w="60" w:type="dxa"/>
-              <w:left w:w="100" w:type="dxa"/>
-              <w:bottom w:w="60" w:type="dxa"/>
-              <w:right w:w="100" w:type="dxa"/>
-            </w:tcMar>
-          </w:tcPr>
-          <w:p>
-            <w:pPr>
-              <w:spacing w:after="20"/>
-              <w:rPr>
-                <w:sz w:val="24"/>
-                <w:szCs w:val="24"/>
-              </w:rPr>
-            </w:pPr>
-            <w:r>
-              <w:rPr>
-                <w:sz w:val="24"/>
-                <w:szCs w:val="24"/>
-              </w:rPr>
+            <w:tcW w:w="2367" w:type="dxa"/>
+            <w:tcBorders>
+              <w:top w:val="single" w:sz="4" w:space="0" w:color="999999"/>
+              <w:left w:val="single" w:sz="4" w:space="0" w:color="999999"/>
+              <w:bottom w:val="single" w:sz="4" w:space="0" w:color="999999"/>
+              <w:right w:val="single" w:sz="4" w:space="0" w:color="999999"/>
+            </w:tcBorders>
+            <w:tcMar>
+              <w:top w:w="60" w:type="dxa"/>
+              <w:left w:w="100" w:type="dxa"/>
+              <w:bottom w:w="60" w:type="dxa"/>
+              <w:right w:w="100" w:type="dxa"/>
+            </w:tcMar>
+          </w:tcPr>
+          <w:p>
+            <w:pPr>
+              <w:spacing w:after="20"/>
+            </w:pPr>
+            <w:r>
               <w:t>bin/rails test PASS; phép thử clone thư mục trống; mở sơ đồ trên draw.io đối chiếu mã</w:t>
             </w:r>
           </w:p>
@@ -15505,43 +15942,137 @@
           <w:szCs w:val="24"/>
           <w:lang w:val="vi-VN"/>
         </w:rPr>
-        <w:t>Tôi cam kết đã khai báo trung thực các phần có sử dụng công cụ AI (Claude – Anthropic) trong bảng trên. Mọi nội dung do AI gợi ý đều đã được tôi đọc hiểu, chạy thử và kiểm chứng trước khi đưa vào sản phẩm. Tôi chịu hoàn toàn trách nhiệm về tính đúng đắn và trung thực của bài làm này.</w:t>
+        <w:t xml:space="preserve">Tôi xác nhận đã đọc, hiểu và </w:t>
+      </w:r>
+      <w:r>
+        <w:rPr>
+          <w:sz w:val="24"/>
+          <w:szCs w:val="24"/>
+          <w:lang w:val="vi-VN"/>
+        </w:rPr>
+        <w:t xml:space="preserve">chịu trách nhiệm về toàn bộ nội dung </w:t>
+      </w:r>
+      <w:r>
+        <w:rPr>
+          <w:sz w:val="24"/>
+          <w:szCs w:val="24"/>
+          <w:lang w:val="vi-VN"/>
+        </w:rPr>
+        <w:t>nộp.</w:t>
       </w:r>
     </w:p>
+    <w:tbl>
+      <w:tblPr>
+        <w:tblStyle w:val="TableGrid"/>
+        <w:tblW w:w="0" w:type="auto"/>
+        <w:tblBorders>
+          <w:top w:val="none" w:sz="0" w:space="0" w:color="auto"/>
+          <w:left w:val="none" w:sz="0" w:space="0" w:color="auto"/>
+          <w:bottom w:val="none" w:sz="0" w:space="0" w:color="auto"/>
+          <w:right w:val="none" w:sz="0" w:space="0" w:color="auto"/>
+          <w:insideH w:val="none" w:sz="0" w:space="0" w:color="auto"/>
+          <w:insideV w:val="none" w:sz="0" w:space="0" w:color="auto"/>
+        </w:tblBorders>
+        <w:tblLook w:val="04A0" w:firstRow="1" w:lastRow="0" w:firstColumn="1" w:lastColumn="0" w:noHBand="0" w:noVBand="1"/>
+      </w:tblPr>
+      <w:tblGrid>
+        <w:gridCol w:w="3209"/>
+        <w:gridCol w:w="3209"/>
+        <w:gridCol w:w="3210"/>
+      </w:tblGrid>
+      <w:tr>
+        <w:tc>
+          <w:tcPr>
+            <w:tcW w:w="3209" w:type="dxa"/>
+          </w:tcPr>
+          <w:p>
+            <w:pPr>
+              <w:rPr>
+                <w:lang w:val="vi-VN"/>
+              </w:rPr>
+            </w:pPr>
+            <w:r>
+              <w:rPr>
+                <w:b/>
+                <w:bCs/>
+                <w:lang w:val="vi-VN"/>
+              </w:rPr>
+              <w:t xml:space="preserve">Họ tên: </w:t>
+            </w:r>
+            <w:r>
+              <w:rPr>
+                <w:lang w:val="vi-VN"/>
+              </w:rPr>
+              <w:t>Thái An Quốc</w:t>
+            </w:r>
+          </w:p>
+        </w:tc>
+        <w:tc>
+          <w:tcPr>
+            <w:tcW w:w="3209" w:type="dxa"/>
+          </w:tcPr>
+          <w:p>
+            <w:pPr>
+              <w:rPr>
+                <w:lang w:val="vi-VN"/>
+              </w:rPr>
+            </w:pPr>
+            <w:r>
+              <w:rPr>
+                <w:b/>
+                <w:bCs/>
+                <w:lang w:val="vi-VN"/>
+              </w:rPr>
+              <w:t xml:space="preserve">MSSV: </w:t>
+            </w:r>
+            <w:r>
+              <w:rPr>
+                <w:lang w:val="vi-VN"/>
+              </w:rPr>
+              <w:t>2374802012635</w:t>
+            </w:r>
+          </w:p>
+        </w:tc>
+        <w:tc>
+          <w:tcPr>
+            <w:tcW w:w="3210" w:type="dxa"/>
+          </w:tcPr>
+          <w:p>
+            <w:pPr>
+              <w:rPr>
+                <w:b/>
+                <w:bCs/>
+                <w:lang w:val="vi-VN"/>
+              </w:rPr>
+            </w:pPr>
+            <w:r>
+              <w:rPr>
+                <w:b/>
+                <w:bCs/>
+                <w:lang w:val="vi-VN"/>
+              </w:rPr>
+              <w:t xml:space="preserve">Ngày: </w:t>
+            </w:r>
+            <w:r>
+              <w:rPr>
+                <w:lang w:val="vi-VN"/>
+              </w:rPr>
+              <w:t>29/10/2026</w:t>
+            </w:r>
+          </w:p>
+        </w:tc>
+      </w:tr>
+    </w:tbl>
     <w:p>
       <w:pPr>
         <w:rPr>
+          <w:b/>
+          <w:bCs/>
           <w:sz w:val="24"/>
           <w:szCs w:val="24"/>
           <w:lang w:val="vi-VN"/>
         </w:rPr>
       </w:pPr>
-      <w:r>
-        <w:rPr>
-          <w:sz w:val="24"/>
-          <w:szCs w:val="24"/>
-          <w:lang w:val="vi-VN"/>
-        </w:rPr>
-        <w:t>Thái An Quốc</w:t>
-      </w:r>
-      <w:r>
-        <w:rPr>
-          <w:sz w:val="24"/>
-          <w:szCs w:val="24"/>
-          <w:lang w:val="vi-VN"/>
-        </w:rPr>
-        <w:br/>
-        <w:t>MSSV: 2374802012635</w:t>
-      </w:r>
-      <w:r>
-        <w:rPr>
-          <w:sz w:val="24"/>
-          <w:szCs w:val="24"/>
-          <w:lang w:val="vi-VN"/>
-        </w:rPr>
-        <w:br/>
-        <w:t>Ngày: 29/10/2026</w:t>
-      </w:r>
     </w:p>
     <w:sectPr>
       <w:footerReference w:type="default" r:id="rId44"/>
@@ -16426,6 +16957,35 @@
       <w:ind w:left="260"/>
     </w:pPr>
   </w:style>
+  <w:style w:type="character" w:styleId="HTMLCode">
+    <w:name w:val="HTML Code"/>
+    <w:basedOn w:val="DefaultParagraphFont"/>
+    <w:uiPriority w:val="99"/>
+    <w:semiHidden/>
+    <w:unhideWhenUsed/>
+    <w:rsid w:val="00733501"/>
+    <w:rPr>
+      <w:rFonts w:ascii="Courier New" w:eastAsia="Times New Roman" w:hAnsi="Courier New" w:cs="Courier New"/>
+      <w:sz w:val="20"/>
+      <w:szCs w:val="20"/>
+    </w:rPr>
+  </w:style>
+  <w:style w:type="table" w:styleId="TableGrid">
+    <w:name w:val="Table Grid"/>
+    <w:basedOn w:val="TableNormal"/>
+    <w:uiPriority w:val="39"/>
+    <w:rsid w:val="00733501"/>
+    <w:tblPr>
+      <w:tblBorders>
+        <w:top w:val="single" w:sz="4" w:space="0" w:color="auto"/>
+        <w:left w:val="single" w:sz="4" w:space="0" w:color="auto"/>
+        <w:bottom w:val="single" w:sz="4" w:space="0" w:color="auto"/>
+        <w:right w:val="single" w:sz="4" w:space="0" w:color="auto"/>
+        <w:insideH w:val="single" w:sz="4" w:space="0" w:color="auto"/>
+        <w:insideV w:val="single" w:sz="4" w:space="0" w:color="auto"/>
+      </w:tblBorders>
+    </w:tblPr>
+  </w:style>
 </w:styles>
 </file>
 

</xml_diff>